<commit_message>
P1: macroscale mesh and penalty check of the homogenised plate model
Refining the Q1 macroscale mesh from 6 to 12 elements per cell and axis
raises the uniform-start compliance from 55.192 to 56.088, so the
underestimation goes from 27.0% to 25.8%. A hundredfold penalty factor
changes it by less than 1e-5 (relative). The linear solve in the check
uses PARDISO; the macroscale model code is unchanged.

Section 5.10 now limits its conclusion to the homogenised model examined
and notes that the cut-band clamp only narrows the gap. Note S6.3 gives
the numbers. EN/CN text, PDFs, DOCX files and the advisor deck rebuilt.

Co-Authored-By: Claude Opus 5.5 <noreply@anthropic.com>
Claude-Session: https://claude.ai/code/session_0114mFUC9kQKF8s1RT519QXM
</commit_message>
<xml_diff>
--- a/docs/paper_p1/word/P1_supp_CN.docx
+++ b/docs/paper_p1/word/P1_supp_CN.docx
@@ -43594,7 +43594,255 @@
         <w:rPr>
           <w:rFonts w:hint="eastAsia"/>
         </w:rPr>
-        <w:t xml:space="preserve">29–33%。未对宏观误差作进一步分析。对于均匀化梯度设计，宏观体积模型不再与细观尺度材料体积精确相等（表</w:t>
+        <w:t xml:space="preserve">29–33%。在均匀初始设计处，将宏观网格加密到每胞每轴</w:t>
+      </w:r>
+      <w:r>
+        <w:t xml:space="preserve"> 12 </w:t>
+      </w:r>
+      <w:r>
+        <w:rPr>
+          <w:rFonts w:hint="eastAsia"/>
+        </w:rPr>
+        <w:t xml:space="preserve">个单元（35,136</w:t>
+      </w:r>
+      <w:r>
+        <w:t xml:space="preserve"> </w:t>
+      </w:r>
+      <w:r>
+        <w:rPr>
+          <w:rFonts w:hint="eastAsia"/>
+        </w:rPr>
+        <w:t xml:space="preserve">个单元，39,949</w:t>
+      </w:r>
+      <w:r>
+        <w:t xml:space="preserve"> </w:t>
+      </w:r>
+      <w:r>
+        <w:rPr>
+          <w:rFonts w:hint="eastAsia"/>
+        </w:rPr>
+        <w:t xml:space="preserve">个节点）后，宏观柔度由</w:t>
+      </w:r>
+      <w:r>
+        <w:t xml:space="preserve"> 55.192 </w:t>
+      </w:r>
+      <w:r>
+        <w:rPr>
+          <w:rFonts w:hint="eastAsia"/>
+        </w:rPr>
+        <w:t xml:space="preserve">升至</w:t>
+      </w:r>
+      <w:r>
+        <w:t xml:space="preserve"> </w:t>
+      </w:r>
+      <w:r>
+        <w:rPr>
+          <w:rFonts w:hint="eastAsia"/>
+        </w:rPr>
+        <w:t xml:space="preserve">56.088（+1.6%），比精确柔度</w:t>
+      </w:r>
+      <w:r>
+        <w:t xml:space="preserve"> 75.599 </w:t>
+      </w:r>
+      <w:r>
+        <w:rPr>
+          <w:rFonts w:hint="eastAsia"/>
+        </w:rPr>
+        <w:t xml:space="preserve">低</w:t>
+      </w:r>
+      <w:r>
+        <w:t xml:space="preserve"> </w:t>
+      </w:r>
+      <w:r>
+        <w:rPr>
+          <w:rFonts w:hint="eastAsia"/>
+        </w:rPr>
+        <w:t xml:space="preserve">25.8%（原为</w:t>
+      </w:r>
+      <w:r>
+        <w:t xml:space="preserve"> </w:t>
+      </w:r>
+      <w:r>
+        <w:rPr>
+          <w:rFonts w:hint="eastAsia"/>
+        </w:rPr>
+        <w:t xml:space="preserve">27.0%）；罚因子由</w:t>
+      </w:r>
+      <w:r>
+        <w:t xml:space="preserve"> </w:t>
+      </w:r>
+      <m:oMath>
+        <m:sSup>
+          <m:e>
+            <m:r>
+              <m:t>10</m:t>
+            </m:r>
+          </m:e>
+          <m:sup>
+            <m:r>
+              <m:t>6</m:t>
+            </m:r>
+          </m:sup>
+        </m:sSup>
+      </m:oMath>
+      <w:r>
+        <w:t xml:space="preserve"> </w:t>
+      </w:r>
+      <w:r>
+        <w:rPr>
+          <w:rFonts w:hint="eastAsia"/>
+        </w:rPr>
+        <w:t xml:space="preserve">增至</w:t>
+      </w:r>
+      <w:r>
+        <w:t xml:space="preserve"> </w:t>
+      </w:r>
+      <m:oMath>
+        <m:sSup>
+          <m:e>
+            <m:r>
+              <m:t>10</m:t>
+            </m:r>
+          </m:e>
+          <m:sup>
+            <m:r>
+              <m:t>8</m:t>
+            </m:r>
+          </m:sup>
+        </m:sSup>
+      </m:oMath>
+      <w:r>
+        <w:t xml:space="preserve"> </w:t>
+      </w:r>
+      <w:r>
+        <w:rPr>
+          <w:rFonts w:hint="eastAsia"/>
+        </w:rPr>
+        <w:t xml:space="preserve">时，宏观柔度的相对变化为</w:t>
+      </w:r>
+      <w:r>
+        <w:t xml:space="preserve"> </w:t>
+      </w:r>
+      <m:oMath>
+        <m:r>
+          <m:rPr>
+            <m:sty m:val="p"/>
+          </m:rPr>
+          <m:t>−</m:t>
+        </m:r>
+        <m:r>
+          <m:t>8.7</m:t>
+        </m:r>
+        <m:r>
+          <m:rPr>
+            <m:sty m:val="p"/>
+          </m:rPr>
+          <m:t>×</m:t>
+        </m:r>
+        <m:sSup>
+          <m:e>
+            <m:r>
+              <m:t>10</m:t>
+            </m:r>
+          </m:e>
+          <m:sup>
+            <m:r>
+              <m:rPr>
+                <m:sty m:val="p"/>
+              </m:rPr>
+              <m:t>−</m:t>
+            </m:r>
+            <m:r>
+              <m:t>6</m:t>
+            </m:r>
+          </m:sup>
+        </m:sSup>
+      </m:oMath>
+      <w:r>
+        <w:rPr>
+          <w:rFonts w:hint="eastAsia"/>
+        </w:rPr>
+        <w:t xml:space="preserve">（6</w:t>
+      </w:r>
+      <w:r>
+        <w:t xml:space="preserve"> </w:t>
+      </w:r>
+      <w:r>
+        <w:rPr>
+          <w:rFonts w:hint="eastAsia"/>
+        </w:rPr>
+        <w:t xml:space="preserve">个单元）和</w:t>
+      </w:r>
+      <w:r>
+        <w:t xml:space="preserve"> </w:t>
+      </w:r>
+      <m:oMath>
+        <m:r>
+          <m:rPr>
+            <m:sty m:val="p"/>
+          </m:rPr>
+          <m:t>−</m:t>
+        </m:r>
+        <m:r>
+          <m:t>3.7</m:t>
+        </m:r>
+        <m:r>
+          <m:rPr>
+            <m:sty m:val="p"/>
+          </m:rPr>
+          <m:t>×</m:t>
+        </m:r>
+        <m:sSup>
+          <m:e>
+            <m:r>
+              <m:t>10</m:t>
+            </m:r>
+          </m:e>
+          <m:sup>
+            <m:r>
+              <m:rPr>
+                <m:sty m:val="p"/>
+              </m:rPr>
+              <m:t>−</m:t>
+            </m:r>
+            <m:r>
+              <m:t>6</m:t>
+            </m:r>
+          </m:sup>
+        </m:sSup>
+      </m:oMath>
+      <w:r>
+        <w:rPr>
+          <w:rFonts w:hint="eastAsia"/>
+        </w:rPr>
+        <w:t xml:space="preserve">（12</w:t>
+      </w:r>
+      <w:r>
+        <w:t xml:space="preserve"> </w:t>
+      </w:r>
+      <w:r>
+        <w:rPr>
+          <w:rFonts w:hint="eastAsia"/>
+        </w:rPr>
+        <w:t xml:space="preserve">个单元）。优化采用每胞每轴</w:t>
+      </w:r>
+      <w:r>
+        <w:t xml:space="preserve"> 6 </w:t>
+      </w:r>
+      <w:r>
+        <w:rPr>
+          <w:rFonts w:hint="eastAsia"/>
+        </w:rPr>
+        <w:t xml:space="preserve">个单元的网格。细观模型固定切割胞的全部切割带自由度（表</w:t>
+      </w:r>
+      <w:r>
+        <w:t xml:space="preserve"> </w:t>
+      </w:r>
+      <w:r>
+        <w:rPr>
+          <w:rFonts w:hint="eastAsia"/>
+        </w:rPr>
+        <w:t xml:space="preserve">ST21），其支撑至少与仅作用于切割面的支撑同样刚硬；这降低了精确柔度，因而缩小而非扩大宏观低估。对于均匀化梯度设计，宏观体积模型不再与细观尺度材料体积精确相等（表</w:t>
       </w:r>
       <w:r>
         <w:t xml:space="preserve"> </w:t>

</xml_diff>

<commit_message>
P1: write the whole-lattice iterative-solver comparison into the paper
- Section 5.9: GAMG-PCG, BoomerAMG-PCG and a BDDC lower bound on the two
  eight-cell lattices.
- Sections 6.3, 6.4 and 7 updated accordingly.
- Supplementary Note S3: method description and Table ST12e.
- PETSc reference added.
- Cover letter limitation updated.
- EN/CN PDFs and DOCX rebuilt.

Co-Authored-By: Claude Opus 5.5 <noreply@anthropic.com>
Claude-Session: https://claude.ai/code/session_0114mFUC9kQKF8s1RT519QXM
</commit_message>
<xml_diff>
--- a/docs/paper_p1/word/P1_supp_CN.docx
+++ b/docs/paper_p1/word/P1_supp_CN.docx
@@ -27800,6 +27800,463 @@
     </w:p>
     <w:p>
       <w:pPr>
+        <w:pStyle w:val="BodyText"/>
+      </w:pPr>
+      <w:r>
+        <w:rPr>
+          <w:rFonts w:hint="eastAsia"/>
+        </w:rPr>
+        <w:t xml:space="preserve">整体格栅迭代求解器（表</w:t>
+      </w:r>
+      <w:r>
+        <w:t xml:space="preserve"> </w:t>
+      </w:r>
+      <w:r>
+        <w:rPr>
+          <w:rFonts w:hint="eastAsia"/>
+        </w:rPr>
+        <w:t xml:space="preserve">ST12e）使用路线</w:t>
+      </w:r>
+      <w:r>
+        <w:t xml:space="preserve"> (a) </w:t>
+      </w:r>
+      <w:r>
+        <w:rPr>
+          <w:rFonts w:hint="eastAsia"/>
+        </w:rPr>
+        <w:t xml:space="preserve">的整体矩阵、载荷向量、固支和编号，一次导出后在路线</w:t>
+      </w:r>
+      <w:r>
+        <w:t xml:space="preserve"> (a) </w:t>
+      </w:r>
+      <w:r>
+        <w:rPr>
+          <w:rFonts w:hint="eastAsia"/>
+        </w:rPr>
+        <w:t xml:space="preserve">和</w:t>
+      </w:r>
+      <w:r>
+        <w:t xml:space="preserve"> (b) </w:t>
+      </w:r>
+      <w:r>
+        <w:rPr>
+          <w:rFonts w:hint="eastAsia"/>
+        </w:rPr>
+        <w:t xml:space="preserve">所用的</w:t>
+      </w:r>
+      <w:r>
+        <w:t xml:space="preserve"> CPU </w:t>
+      </w:r>
+      <w:r>
+        <w:rPr>
+          <w:rFonts w:hint="eastAsia"/>
+        </w:rPr>
+        <w:t xml:space="preserve">上以</w:t>
+      </w:r>
+      <w:r>
+        <w:t xml:space="preserve"> 16 </w:t>
+      </w:r>
+      <w:r>
+        <w:rPr>
+          <w:rFonts w:hint="eastAsia"/>
+        </w:rPr>
+        <w:t xml:space="preserve">个</w:t>
+      </w:r>
+      <w:r>
+        <w:t xml:space="preserve"> MPI </w:t>
+      </w:r>
+      <w:r>
+        <w:rPr>
+          <w:rFonts w:hint="eastAsia"/>
+        </w:rPr>
+        <w:t xml:space="preserve">进程用</w:t>
+      </w:r>
+      <w:r>
+        <w:t xml:space="preserve"> PETSc 3.26</w:t>
+      </w:r>
+      <w:r>
+        <w:t xml:space="preserve"> </w:t>
+      </w:r>
+      <w:hyperlink r:id="rId9">
+        <w:r>
+          <w:rPr>
+            <w:rStyle w:val="Hyperlink"/>
+          </w:rPr>
+          <w:t xml:space="preserve">Balay et al. (2026)</w:t>
+        </w:r>
+      </w:hyperlink>
+      <w:r>
+        <w:t xml:space="preserve"> </w:t>
+      </w:r>
+      <w:r>
+        <w:rPr>
+          <w:rFonts w:hint="eastAsia"/>
+        </w:rPr>
+        <w:t xml:space="preserve">求解。共轭梯度法在未缩放的系统上运行，以未预条件的相对残差</w:t>
+      </w:r>
+      <w:r>
+        <w:t xml:space="preserve"> </w:t>
+      </w:r>
+      <m:oMath>
+        <m:r>
+          <m:rPr>
+            <m:sty m:val="p"/>
+          </m:rPr>
+          <m:t>∥</m:t>
+        </m:r>
+        <m:r>
+          <m:t>K</m:t>
+        </m:r>
+        <m:r>
+          <m:t>u</m:t>
+        </m:r>
+        <m:r>
+          <m:rPr>
+            <m:sty m:val="p"/>
+          </m:rPr>
+          <m:t>−</m:t>
+        </m:r>
+        <m:r>
+          <m:t>f</m:t>
+        </m:r>
+        <m:r>
+          <m:rPr>
+            <m:sty m:val="p"/>
+          </m:rPr>
+          <m:t>∥</m:t>
+        </m:r>
+        <m:r>
+          <m:rPr>
+            <m:sty m:val="p"/>
+          </m:rPr>
+          <m:t>/</m:t>
+        </m:r>
+        <m:r>
+          <m:rPr>
+            <m:sty m:val="p"/>
+          </m:rPr>
+          <m:t>∥</m:t>
+        </m:r>
+        <m:r>
+          <m:t>f</m:t>
+        </m:r>
+        <m:r>
+          <m:rPr>
+            <m:sty m:val="p"/>
+          </m:rPr>
+          <m:t>∥</m:t>
+        </m:r>
+        <m:r>
+          <m:rPr>
+            <m:sty m:val="p"/>
+          </m:rPr>
+          <m:t>≤</m:t>
+        </m:r>
+        <m:sSup>
+          <m:e>
+            <m:r>
+              <m:t>10</m:t>
+            </m:r>
+          </m:e>
+          <m:sup>
+            <m:r>
+              <m:rPr>
+                <m:sty m:val="p"/>
+              </m:rPr>
+              <m:t>−</m:t>
+            </m:r>
+            <m:r>
+              <m:t>9</m:t>
+            </m:r>
+          </m:sup>
+        </m:sSup>
+      </m:oMath>
+      <w:r>
+        <w:t xml:space="preserve"> </w:t>
+      </w:r>
+      <w:r>
+        <w:rPr>
+          <w:rFonts w:hint="eastAsia"/>
+        </w:rPr>
+        <w:t xml:space="preserve">为停止条件；在残差首次低于</w:t>
+      </w:r>
+      <w:r>
+        <w:t xml:space="preserve"> </w:t>
+      </w:r>
+      <m:oMath>
+        <m:sSup>
+          <m:e>
+            <m:r>
+              <m:t>10</m:t>
+            </m:r>
+          </m:e>
+          <m:sup>
+            <m:r>
+              <m:rPr>
+                <m:sty m:val="p"/>
+              </m:rPr>
+              <m:t>−</m:t>
+            </m:r>
+            <m:r>
+              <m:t>3</m:t>
+            </m:r>
+          </m:sup>
+        </m:sSup>
+        <m:r>
+          <m:rPr>
+            <m:sty m:val="p"/>
+          </m:rPr>
+          <m:t>,</m:t>
+        </m:r>
+        <m:sSup>
+          <m:e>
+            <m:r>
+              <m:t>10</m:t>
+            </m:r>
+          </m:e>
+          <m:sup>
+            <m:r>
+              <m:rPr>
+                <m:sty m:val="p"/>
+              </m:rPr>
+              <m:t>−</m:t>
+            </m:r>
+            <m:r>
+              <m:t>4</m:t>
+            </m:r>
+          </m:sup>
+        </m:sSup>
+        <m:r>
+          <m:rPr>
+            <m:sty m:val="p"/>
+          </m:rPr>
+          <m:t>,</m:t>
+        </m:r>
+        <m:r>
+          <m:rPr>
+            <m:sty m:val="p"/>
+          </m:rPr>
+          <m:t>…</m:t>
+        </m:r>
+      </m:oMath>
+      <w:r>
+        <w:t xml:space="preserve"> </w:t>
+      </w:r>
+      <w:r>
+        <w:rPr>
+          <w:rFonts w:hint="eastAsia"/>
+        </w:rPr>
+        <w:t xml:space="preserve">处记录迭代解，并给出其柔度和能量范数与最终迭代解之差。GAMG（光滑聚集，PETSc</w:t>
+      </w:r>
+      <w:r>
+        <w:t xml:space="preserve"> </w:t>
+      </w:r>
+      <w:r>
+        <w:rPr>
+          <w:rFonts w:hint="eastAsia"/>
+        </w:rPr>
+        <w:t xml:space="preserve">默认设置）采用块大小</w:t>
+      </w:r>
+      <w:r>
+        <w:t xml:space="preserve"> </w:t>
+      </w:r>
+      <w:r>
+        <w:rPr>
+          <w:rFonts w:hint="eastAsia"/>
+        </w:rPr>
+        <w:t xml:space="preserve">3，并以自由度位置的六个刚体模态为近零空间；BoomerAMG</w:t>
+      </w:r>
+      <w:r>
+        <w:t xml:space="preserve"> </w:t>
+      </w:r>
+      <w:r>
+        <w:rPr>
+          <w:rFonts w:hint="eastAsia"/>
+        </w:rPr>
+        <w:t xml:space="preserve">采用</w:t>
+      </w:r>
+      <w:r>
+        <w:t xml:space="preserve"> HMIS </w:t>
+      </w:r>
+      <w:r>
+        <w:rPr>
+          <w:rFonts w:hint="eastAsia"/>
+        </w:rPr>
+        <w:t xml:space="preserve">粗化、extended+i</w:t>
+      </w:r>
+      <w:r>
+        <w:t xml:space="preserve"> </w:t>
+      </w:r>
+      <w:r>
+        <w:rPr>
+          <w:rFonts w:hint="eastAsia"/>
+        </w:rPr>
+        <w:t xml:space="preserve">插值、节点粗化、强连接阈值</w:t>
+      </w:r>
+      <w:r>
+        <w:t xml:space="preserve"> 0.5 </w:t>
+      </w:r>
+      <w:r>
+        <w:rPr>
+          <w:rFonts w:hint="eastAsia"/>
+        </w:rPr>
+        <w:t xml:space="preserve">及其默认松弛。对于每胞一个子区域、采用精确局部求解的</w:t>
+      </w:r>
+      <w:r>
+        <w:t xml:space="preserve"> </w:t>
+      </w:r>
+      <w:r>
+        <w:rPr>
+          <w:rFonts w:hint="eastAsia"/>
+        </w:rPr>
+        <w:t xml:space="preserve">BDDC，胞的</w:t>
+      </w:r>
+      <w:r>
+        <w:t xml:space="preserve"> Dirichlet </w:t>
+      </w:r>
+      <w:r>
+        <w:rPr>
+          <w:rFonts w:hint="eastAsia"/>
+        </w:rPr>
+        <w:t xml:space="preserve">矩阵是其在不与其他胞共享的自由度上的刚度，Neumann</w:t>
+      </w:r>
+      <w:r>
+        <w:t xml:space="preserve"> </w:t>
+      </w:r>
+      <w:r>
+        <w:rPr>
+          <w:rFonts w:hint="eastAsia"/>
+        </w:rPr>
+        <w:t xml:space="preserve">矩阵是其在自由自由度上的整胞刚度。二者均按路线</w:t>
+      </w:r>
+      <w:r>
+        <w:t xml:space="preserve"> (a) </w:t>
+      </w:r>
+      <w:r>
+        <w:rPr>
+          <w:rFonts w:hint="eastAsia"/>
+        </w:rPr>
+        <w:t xml:space="preserve">的</w:t>
+      </w:r>
+      <w:r>
+        <w:t xml:space="preserve"> PARDISO </w:t>
+      </w:r>
+      <w:r>
+        <w:rPr>
+          <w:rFonts w:hint="eastAsia"/>
+        </w:rPr>
+        <w:t xml:space="preserve">配置（对称</w:t>
+      </w:r>
+      <w:r>
+        <w:t xml:space="preserve"> Jacobi </w:t>
+      </w:r>
+      <w:r>
+        <w:rPr>
+          <w:rFonts w:hint="eastAsia"/>
+        </w:rPr>
+        <w:t xml:space="preserve">缩放、实对称正定</w:t>
+      </w:r>
+      <w:r>
+        <w:t xml:space="preserve"> </w:t>
+      </w:r>
+      <w:r>
+        <w:rPr>
+          <w:rFonts w:hint="eastAsia"/>
+        </w:rPr>
+        <w:t xml:space="preserve">Cholesky、调优的</w:t>
+      </w:r>
+      <w:r>
+        <w:t xml:space="preserve"> iparm、16 </w:t>
+      </w:r>
+      <w:r>
+        <w:rPr>
+          <w:rFonts w:hint="eastAsia"/>
+        </w:rPr>
+        <w:t xml:space="preserve">线程）逐胞各分解一次；悬浮胞的奇异</w:t>
+      </w:r>
+      <w:r>
+        <w:t xml:space="preserve"> Neumann </w:t>
+      </w:r>
+      <w:r>
+        <w:rPr>
+          <w:rFonts w:hint="eastAsia"/>
+        </w:rPr>
+        <w:t xml:space="preserve">矩阵在缩放矩阵的对角线上加</w:t>
+      </w:r>
+      <w:r>
+        <w:t xml:space="preserve"> </w:t>
+      </w:r>
+      <m:oMath>
+        <m:sSup>
+          <m:e>
+            <m:r>
+              <m:t>10</m:t>
+            </m:r>
+          </m:e>
+          <m:sup>
+            <m:r>
+              <m:rPr>
+                <m:sty m:val="p"/>
+              </m:rPr>
+              <m:t>−</m:t>
+            </m:r>
+            <m:r>
+              <m:t>10</m:t>
+            </m:r>
+          </m:sup>
+        </m:sSup>
+      </m:oMath>
+      <w:r>
+        <w:t xml:space="preserve"> </w:t>
+      </w:r>
+      <w:r>
+        <w:rPr>
+          <w:rFonts w:hint="eastAsia"/>
+        </w:rPr>
+        <w:t xml:space="preserve">的平移。这些分解的总时间是</w:t>
+      </w:r>
+      <w:r>
+        <w:t xml:space="preserve"> BDDC </w:t>
+      </w:r>
+      <w:r>
+        <w:rPr>
+          <w:rFonts w:hint="eastAsia"/>
+        </w:rPr>
+        <w:t xml:space="preserve">每个几何成本的下界，不含其约束</w:t>
+      </w:r>
+      <w:r>
+        <w:t xml:space="preserve"> Neumann </w:t>
+      </w:r>
+      <w:r>
+        <w:rPr>
+          <w:rFonts w:hint="eastAsia"/>
+        </w:rPr>
+        <w:t xml:space="preserve">求解、粗问题和迭代。以</w:t>
+      </w:r>
+      <w:r>
+        <w:t xml:space="preserve"> MUMPS </w:t>
+      </w:r>
+      <w:r>
+        <w:rPr>
+          <w:rFonts w:hint="eastAsia"/>
+        </w:rPr>
+        <w:t xml:space="preserve">求解局部和粗问题、在八个进程上同时保存全部局部分解时，BDDC</w:t>
+      </w:r>
+      <w:r>
+        <w:t xml:space="preserve"> </w:t>
+      </w:r>
+      <w:r>
+        <w:rPr>
+          <w:rFonts w:hint="eastAsia"/>
+        </w:rPr>
+        <w:t xml:space="preserve">在建立阶段内存超过</w:t>
+      </w:r>
+      <w:r>
+        <w:t xml:space="preserve"> 90 GiB。</w:t>
+      </w:r>
+    </w:p>
+    <w:p>
+      <w:pPr>
         <w:pStyle w:val="Heading3"/>
       </w:pPr>
       <w:r>
@@ -30322,6 +30779,596 @@
           <w:rFonts w:hint="eastAsia"/>
         </w:rPr>
         <w:t xml:space="preserve">S4.1）：四胞格栅的全部胞，以及每个八胞格栅中的四个胞。</w:t>
+      </w:r>
+    </w:p>
+    <w:p>
+      <w:pPr>
+        <w:pStyle w:val="Heading4"/>
+      </w:pPr>
+      <w:r>
+        <w:t xml:space="preserve">ST12e. CPU </w:t>
+      </w:r>
+      <w:r>
+        <w:rPr>
+          <w:rFonts w:hint="eastAsia"/>
+        </w:rPr>
+        <w:t xml:space="preserve">上的整体格栅迭代求解器（16</w:t>
+      </w:r>
+      <w:r>
+        <w:t xml:space="preserve"> </w:t>
+      </w:r>
+      <w:r>
+        <w:rPr>
+          <w:rFonts w:hint="eastAsia"/>
+        </w:rPr>
+        <w:t xml:space="preserve">个</w:t>
+      </w:r>
+      <w:r>
+        <w:t xml:space="preserve"> MPI </w:t>
+      </w:r>
+      <w:r>
+        <w:rPr>
+          <w:rFonts w:hint="eastAsia"/>
+        </w:rPr>
+        <w:t xml:space="preserve">进程）：建立阶段、共轭梯度与</w:t>
+      </w:r>
+      <w:r>
+        <w:t xml:space="preserve"> BDDC </w:t>
+      </w:r>
+      <w:r>
+        <w:rPr>
+          <w:rFonts w:hint="eastAsia"/>
+        </w:rPr>
+        <w:t xml:space="preserve">分解（s）</w:t>
+      </w:r>
+    </w:p>
+    <w:tbl>
+      <w:tblPr>
+        <w:tblStyle w:val="Table"/>
+        <w:tblW w:type="pct" w:w="5000"/>
+        <w:tblLayout w:type="fixed"/>
+        <w:tblLook w:firstRow="1" w:lastRow="0" w:firstColumn="0" w:lastColumn="0" w:noHBand="0" w:noVBand="0" w:val="0020"/>
+      </w:tblPr>
+      <w:tblGrid>
+        <w:gridCol w:w="1131"/>
+        <w:gridCol w:w="1131"/>
+        <w:gridCol w:w="1131"/>
+        <w:gridCol w:w="1131"/>
+        <w:gridCol w:w="1131"/>
+        <w:gridCol w:w="1131"/>
+        <w:gridCol w:w="1131"/>
+      </w:tblGrid>
+      <w:tr>
+        <w:trPr>
+          <w:tblHeader w:val="on"/>
+        </w:trPr>
+        <w:tc>
+          <w:tcPr/>
+          <w:p>
+            <w:pPr>
+              <w:pStyle w:val="Compact"/>
+            </w:pPr>
+            <w:r>
+              <w:rPr>
+                <w:rFonts w:hint="eastAsia"/>
+              </w:rPr>
+              <w:t xml:space="preserve">格栅</w:t>
+            </w:r>
+          </w:p>
+        </w:tc>
+        <w:tc>
+          <w:tcPr/>
+          <w:p>
+            <w:pPr>
+              <w:pStyle w:val="Compact"/>
+            </w:pPr>
+            <w:r>
+              <w:rPr>
+                <w:rFonts w:hint="eastAsia"/>
+              </w:rPr>
+              <w:t xml:space="preserve">GAMG：建立阶段</w:t>
+            </w:r>
+          </w:p>
+        </w:tc>
+        <w:tc>
+          <w:tcPr/>
+          <w:p>
+            <w:pPr>
+              <w:pStyle w:val="Compact"/>
+            </w:pPr>
+            <w:r>
+              <w:t xml:space="preserve">GAMG </w:t>
+            </w:r>
+            <w:r>
+              <w:rPr>
+                <w:rFonts w:hint="eastAsia"/>
+              </w:rPr>
+              <w:t xml:space="preserve">至</w:t>
+            </w:r>
+            <w:r>
+              <w:t xml:space="preserve"> </w:t>
+            </w:r>
+            <m:oMath>
+              <m:sSup>
+                <m:e>
+                  <m:r>
+                    <m:t>10</m:t>
+                  </m:r>
+                </m:e>
+                <m:sup>
+                  <m:r>
+                    <m:rPr>
+                      <m:sty m:val="p"/>
+                    </m:rPr>
+                    <m:t>−</m:t>
+                  </m:r>
+                  <m:r>
+                    <m:t>4</m:t>
+                  </m:r>
+                </m:sup>
+              </m:sSup>
+            </m:oMath>
+            <w:r>
+              <w:rPr>
+                <w:rFonts w:hint="eastAsia"/>
+              </w:rPr>
+              <w:t xml:space="preserve">：迭代次数</w:t>
+            </w:r>
+            <w:r>
+              <w:t xml:space="preserve"> / </w:t>
+            </w:r>
+            <w:r>
+              <w:rPr>
+                <w:rFonts w:hint="eastAsia"/>
+              </w:rPr>
+              <w:t xml:space="preserve">每个载荷时间</w:t>
+            </w:r>
+          </w:p>
+        </w:tc>
+        <w:tc>
+          <w:tcPr/>
+          <w:p>
+            <w:pPr>
+              <w:pStyle w:val="Compact"/>
+            </w:pPr>
+            <w:r>
+              <w:t xml:space="preserve">GAMG </w:t>
+            </w:r>
+            <w:r>
+              <w:rPr>
+                <w:rFonts w:hint="eastAsia"/>
+              </w:rPr>
+              <w:t xml:space="preserve">至</w:t>
+            </w:r>
+            <w:r>
+              <w:t xml:space="preserve"> </w:t>
+            </w:r>
+            <m:oMath>
+              <m:sSup>
+                <m:e>
+                  <m:r>
+                    <m:t>10</m:t>
+                  </m:r>
+                </m:e>
+                <m:sup>
+                  <m:r>
+                    <m:rPr>
+                      <m:sty m:val="p"/>
+                    </m:rPr>
+                    <m:t>−</m:t>
+                  </m:r>
+                  <m:r>
+                    <m:t>4</m:t>
+                  </m:r>
+                </m:sup>
+              </m:sSup>
+            </m:oMath>
+            <w:r>
+              <w:rPr>
+                <w:rFonts w:hint="eastAsia"/>
+              </w:rPr>
+              <w:t xml:space="preserve">，含建立阶段：3</w:t>
+            </w:r>
+            <w:r>
+              <w:t xml:space="preserve"> </w:t>
+            </w:r>
+            <w:r>
+              <w:rPr>
+                <w:rFonts w:hint="eastAsia"/>
+              </w:rPr>
+              <w:t xml:space="preserve">个载荷</w:t>
+            </w:r>
+            <w:r>
+              <w:t xml:space="preserve"> / 6 </w:t>
+            </w:r>
+            <w:r>
+              <w:rPr>
+                <w:rFonts w:hint="eastAsia"/>
+              </w:rPr>
+              <w:t xml:space="preserve">个载荷</w:t>
+            </w:r>
+          </w:p>
+        </w:tc>
+        <w:tc>
+          <w:tcPr/>
+          <w:p>
+            <w:pPr>
+              <w:pStyle w:val="Compact"/>
+            </w:pPr>
+            <w:r>
+              <w:t xml:space="preserve">GAMG </w:t>
+            </w:r>
+            <w:r>
+              <w:rPr>
+                <w:rFonts w:hint="eastAsia"/>
+              </w:rPr>
+              <w:t xml:space="preserve">在</w:t>
+            </w:r>
+            <w:r>
+              <w:t xml:space="preserve"> </w:t>
+            </w:r>
+            <m:oMath>
+              <m:sSup>
+                <m:e>
+                  <m:r>
+                    <m:t>10</m:t>
+                  </m:r>
+                </m:e>
+                <m:sup>
+                  <m:r>
+                    <m:rPr>
+                      <m:sty m:val="p"/>
+                    </m:rPr>
+                    <m:t>−</m:t>
+                  </m:r>
+                  <m:r>
+                    <m:t>4</m:t>
+                  </m:r>
+                </m:sup>
+              </m:sSup>
+            </m:oMath>
+            <w:r>
+              <w:t xml:space="preserve"> </w:t>
+            </w:r>
+            <w:r>
+              <w:rPr>
+                <w:rFonts w:hint="eastAsia"/>
+              </w:rPr>
+              <w:t xml:space="preserve">处：柔度</w:t>
+            </w:r>
+            <w:r>
+              <w:t xml:space="preserve"> / </w:t>
+            </w:r>
+            <w:r>
+              <w:rPr>
+                <w:rFonts w:hint="eastAsia"/>
+              </w:rPr>
+              <w:t xml:space="preserve">能量的最大差别</w:t>
+            </w:r>
+          </w:p>
+        </w:tc>
+        <w:tc>
+          <w:tcPr/>
+          <w:p>
+            <w:pPr>
+              <w:pStyle w:val="Compact"/>
+            </w:pPr>
+            <w:r>
+              <w:rPr>
+                <w:rFonts w:hint="eastAsia"/>
+              </w:rPr>
+              <w:t xml:space="preserve">BoomerAMG：建立阶段</w:t>
+            </w:r>
+            <w:r>
+              <w:t xml:space="preserve"> / </w:t>
+            </w:r>
+            <w:r>
+              <w:rPr>
+                <w:rFonts w:hint="eastAsia"/>
+              </w:rPr>
+              <w:t xml:space="preserve">迭代次数</w:t>
+            </w:r>
+            <w:r>
+              <w:t xml:space="preserve"> / </w:t>
+            </w:r>
+            <w:r>
+              <w:rPr>
+                <w:rFonts w:hint="eastAsia"/>
+              </w:rPr>
+              <w:t xml:space="preserve">每个载荷时间</w:t>
+            </w:r>
+          </w:p>
+        </w:tc>
+        <w:tc>
+          <w:tcPr/>
+          <w:p>
+            <w:pPr>
+              <w:pStyle w:val="Compact"/>
+            </w:pPr>
+            <w:r>
+              <w:t xml:space="preserve">BDDC </w:t>
+            </w:r>
+            <w:r>
+              <w:rPr>
+                <w:rFonts w:hint="eastAsia"/>
+              </w:rPr>
+              <w:t xml:space="preserve">分解：Dirichlet</w:t>
+            </w:r>
+            <w:r>
+              <w:t xml:space="preserve"> + Neumann</w:t>
+            </w:r>
+          </w:p>
+        </w:tc>
+      </w:tr>
+      <w:tr>
+        <w:tc>
+          <w:tcPr/>
+          <w:p>
+            <w:pPr>
+              <w:pStyle w:val="Compact"/>
+            </w:pPr>
+            <w:r>
+              <w:t xml:space="preserve">2×2×2</w:t>
+            </w:r>
+          </w:p>
+        </w:tc>
+        <w:tc>
+          <w:tcPr/>
+          <w:p>
+            <w:pPr>
+              <w:pStyle w:val="Compact"/>
+            </w:pPr>
+            <w:r>
+              <w:t xml:space="preserve">35.3</w:t>
+            </w:r>
+          </w:p>
+        </w:tc>
+        <w:tc>
+          <w:tcPr/>
+          <w:p>
+            <w:pPr>
+              <w:pStyle w:val="Compact"/>
+            </w:pPr>
+            <w:r>
+              <w:t xml:space="preserve">90–134 / 52–72</w:t>
+            </w:r>
+          </w:p>
+        </w:tc>
+        <w:tc>
+          <w:tcPr/>
+          <w:p>
+            <w:pPr>
+              <w:pStyle w:val="Compact"/>
+            </w:pPr>
+            <w:r>
+              <w:t xml:space="preserve">221 / 432</w:t>
+            </w:r>
+          </w:p>
+        </w:tc>
+        <w:tc>
+          <w:tcPr/>
+          <w:p>
+            <w:pPr>
+              <w:pStyle w:val="Compact"/>
+            </w:pPr>
+            <w:r>
+              <w:t xml:space="preserve">4.6e-10 / 2.1e-5</w:t>
+            </w:r>
+          </w:p>
+        </w:tc>
+        <w:tc>
+          <w:tcPr/>
+          <w:p>
+            <w:pPr>
+              <w:pStyle w:val="Compact"/>
+            </w:pPr>
+            <w:r>
+              <w:t xml:space="preserve">88.0 / </w:t>
+            </w:r>
+            <w:r>
+              <w:rPr>
+                <w:rFonts w:hint="eastAsia"/>
+              </w:rPr>
+              <w:t xml:space="preserve">预条件子不定</w:t>
+            </w:r>
+          </w:p>
+        </w:tc>
+        <w:tc>
+          <w:tcPr/>
+          <w:p>
+            <w:pPr>
+              <w:pStyle w:val="Compact"/>
+            </w:pPr>
+            <w:r>
+              <w:t xml:space="preserve">207.9 + 241.3 = 449.2</w:t>
+            </w:r>
+          </w:p>
+        </w:tc>
+      </w:tr>
+      <w:tr>
+        <w:tc>
+          <w:tcPr/>
+          <w:p>
+            <w:pPr>
+              <w:pStyle w:val="Compact"/>
+            </w:pPr>
+            <w:r>
+              <w:t xml:space="preserve">3×3×1</w:t>
+            </w:r>
+          </w:p>
+        </w:tc>
+        <w:tc>
+          <w:tcPr/>
+          <w:p>
+            <w:pPr>
+              <w:pStyle w:val="Compact"/>
+            </w:pPr>
+            <w:r>
+              <w:t xml:space="preserve">39.2</w:t>
+            </w:r>
+          </w:p>
+        </w:tc>
+        <w:tc>
+          <w:tcPr/>
+          <w:p>
+            <w:pPr>
+              <w:pStyle w:val="Compact"/>
+            </w:pPr>
+            <w:r>
+              <w:t xml:space="preserve">98–123 / 66–84</w:t>
+            </w:r>
+          </w:p>
+        </w:tc>
+        <w:tc>
+          <w:tcPr/>
+          <w:p>
+            <w:pPr>
+              <w:pStyle w:val="Compact"/>
+            </w:pPr>
+            <w:r>
+              <w:t xml:space="preserve">278 / 478</w:t>
+            </w:r>
+          </w:p>
+        </w:tc>
+        <w:tc>
+          <w:tcPr/>
+          <w:p>
+            <w:pPr>
+              <w:pStyle w:val="Compact"/>
+            </w:pPr>
+            <w:r>
+              <w:t xml:space="preserve">1.4e-10 / 1.2e-5</w:t>
+            </w:r>
+          </w:p>
+        </w:tc>
+        <w:tc>
+          <w:tcPr/>
+          <w:p>
+            <w:pPr>
+              <w:pStyle w:val="Compact"/>
+            </w:pPr>
+            <w:r>
+              <w:t xml:space="preserve">96.6 / 329–336 / 535–615</w:t>
+            </w:r>
+          </w:p>
+        </w:tc>
+        <w:tc>
+          <w:tcPr/>
+          <w:p>
+            <w:pPr>
+              <w:pStyle w:val="Compact"/>
+            </w:pPr>
+            <w:r>
+              <w:t xml:space="preserve">245.3 + 277.9 = 523.1</w:t>
+            </w:r>
+          </w:p>
+        </w:tc>
+      </w:tr>
+    </w:tbl>
+    <w:p>
+      <w:pPr>
+        <w:pStyle w:val="BodyText"/>
+      </w:pPr>
+      <w:r>
+        <w:rPr>
+          <w:rFonts w:hint="eastAsia"/>
+        </w:rPr>
+        <w:t xml:space="preserve">差别相对于相对残差</w:t>
+      </w:r>
+      <w:r>
+        <w:t xml:space="preserve"> </w:t>
+      </w:r>
+      <m:oMath>
+        <m:sSup>
+          <m:e>
+            <m:r>
+              <m:t>10</m:t>
+            </m:r>
+          </m:e>
+          <m:sup>
+            <m:r>
+              <m:rPr>
+                <m:sty m:val="p"/>
+              </m:rPr>
+              <m:t>−</m:t>
+            </m:r>
+            <m:r>
+              <m:t>9</m:t>
+            </m:r>
+          </m:sup>
+        </m:sSup>
+      </m:oMath>
+      <w:r>
+        <w:t xml:space="preserve"> </w:t>
+      </w:r>
+      <w:r>
+        <w:rPr>
+          <w:rFonts w:hint="eastAsia"/>
+        </w:rPr>
+        <w:t xml:space="preserve">处的迭代解，GAMG</w:t>
+      </w:r>
+      <w:r>
+        <w:t xml:space="preserve"> </w:t>
+      </w:r>
+      <w:r>
+        <w:rPr>
+          <w:rFonts w:hint="eastAsia"/>
+        </w:rPr>
+        <w:t xml:space="preserve">达到该残差需</w:t>
+      </w:r>
+      <w:r>
+        <w:t xml:space="preserve"> 235–274 </w:t>
+      </w:r>
+      <w:r>
+        <w:rPr>
+          <w:rFonts w:hint="eastAsia"/>
+        </w:rPr>
+        <w:t xml:space="preserve">次（2×2×2）和</w:t>
+      </w:r>
+      <w:r>
+        <w:t xml:space="preserve"> 204–220 </w:t>
+      </w:r>
+      <w:r>
+        <w:rPr>
+          <w:rFonts w:hint="eastAsia"/>
+        </w:rPr>
+        <w:t xml:space="preserve">次（3×3×1）迭代。载荷：与路线</w:t>
+      </w:r>
+      <w:r>
+        <w:t xml:space="preserve"> (a) </w:t>
+      </w:r>
+      <w:r>
+        <w:rPr>
+          <w:rFonts w:hint="eastAsia"/>
+        </w:rPr>
+        <w:t xml:space="preserve">相同，先三个一致面力，后三个随机载荷。不含所有精确路线共有的胞设置与装配（表</w:t>
+      </w:r>
+      <w:r>
+        <w:t xml:space="preserve"> </w:t>
+      </w:r>
+      <w:r>
+        <w:rPr>
+          <w:rFonts w:hint="eastAsia"/>
+        </w:rPr>
+        <w:t xml:space="preserve">ST12b：416</w:t>
+      </w:r>
+      <w:r>
+        <w:t xml:space="preserve"> s </w:t>
+      </w:r>
+      <w:r>
+        <w:rPr>
+          <w:rFonts w:hint="eastAsia"/>
+        </w:rPr>
+        <w:t xml:space="preserve">和</w:t>
+      </w:r>
+      <w:r>
+        <w:t xml:space="preserve"> 474 </w:t>
+      </w:r>
+      <w:r>
+        <w:rPr>
+          <w:rFonts w:hint="eastAsia"/>
+        </w:rPr>
+        <w:t xml:space="preserve">s）。</w:t>
       </w:r>
     </w:p>
     <w:p>
@@ -38248,7 +39295,7 @@
             <w:r>
               <w:t xml:space="preserve"> </w:t>
             </w:r>
-            <w:hyperlink r:id="rId9">
+            <w:hyperlink r:id="rId10">
               <w:r>
                 <w:rPr>
                   <w:rStyle w:val="Hyperlink"/>
@@ -49862,18 +50909,18 @@
           <wp:inline>
             <wp:extent cx="5334000" cy="3384606"/>
             <wp:effectExtent b="0" l="0" r="0" t="0"/>
-            <wp:docPr descr="Figure S01" title="" id="11" name="Picture"/>
+            <wp:docPr descr="Figure S01" title="" id="12" name="Picture"/>
             <a:graphic>
               <a:graphicData uri="http://schemas.openxmlformats.org/drawingml/2006/picture">
                 <pic:pic>
                   <pic:nvPicPr>
-                    <pic:cNvPr descr="figures/S06_reference_verification.png" id="12" name="Picture"/>
+                    <pic:cNvPr descr="figures/S06_reference_verification.png" id="13" name="Picture"/>
                     <pic:cNvPicPr>
                       <a:picLocks noChangeArrowheads="1" noChangeAspect="1"/>
                     </pic:cNvPicPr>
                   </pic:nvPicPr>
                   <pic:blipFill>
-                    <a:blip r:embed="rId10"/>
+                    <a:blip r:embed="rId11"/>
                     <a:stretch>
                       <a:fillRect/>
                     </a:stretch>
@@ -50386,18 +51433,18 @@
           <wp:inline>
             <wp:extent cx="5334000" cy="5426887"/>
             <wp:effectExtent b="0" l="0" r="0" t="0"/>
-            <wp:docPr descr="Figure S02" title="" id="14" name="Picture"/>
+            <wp:docPr descr="Figure S02" title="" id="15" name="Picture"/>
             <a:graphic>
               <a:graphicData uri="http://schemas.openxmlformats.org/drawingml/2006/picture">
                 <pic:pic>
                   <pic:nvPicPr>
-                    <pic:cNvPr descr="figures/S01_distributions.png" id="15" name="Picture"/>
+                    <pic:cNvPr descr="figures/S01_distributions.png" id="16" name="Picture"/>
                     <pic:cNvPicPr>
                       <a:picLocks noChangeArrowheads="1" noChangeAspect="1"/>
                     </pic:cNvPicPr>
                   </pic:nvPicPr>
                   <pic:blipFill>
-                    <a:blip r:embed="rId13"/>
+                    <a:blip r:embed="rId14"/>
                     <a:stretch>
                       <a:fillRect/>
                     </a:stretch>
@@ -50506,18 +51553,18 @@
           <wp:inline>
             <wp:extent cx="5334000" cy="3822909"/>
             <wp:effectExtent b="0" l="0" r="0" t="0"/>
-            <wp:docPr descr="Figure S03" title="" id="17" name="Picture"/>
+            <wp:docPr descr="Figure S03" title="" id="18" name="Picture"/>
             <a:graphic>
               <a:graphicData uri="http://schemas.openxmlformats.org/drawingml/2006/picture">
                 <pic:pic>
                   <pic:nvPicPr>
-                    <pic:cNvPr descr="figures/S03_sensitivity_diagnostics.png" id="18" name="Picture"/>
+                    <pic:cNvPr descr="figures/S03_sensitivity_diagnostics.png" id="19" name="Picture"/>
                     <pic:cNvPicPr>
                       <a:picLocks noChangeArrowheads="1" noChangeAspect="1"/>
                     </pic:cNvPicPr>
                   </pic:nvPicPr>
                   <pic:blipFill>
-                    <a:blip r:embed="rId16"/>
+                    <a:blip r:embed="rId17"/>
                     <a:stretch>
                       <a:fillRect/>
                     </a:stretch>

</xml_diff>

<commit_message>
P1 stage 7: apply re-review fixes (EN/CN), rebuild PDFs, Word files and advisor deck
Corrections: sensitivity bound stated at order sqrt(eps) (H.4); network
described as solver-like in data flow only; transpose and complexity
statements tightened; NICE's own harmonic-start ratios (5.4-265); 4.2 GiB
at the median 23,604 retained DOFs; AMG figures at 1e-4; setup-time
naming; positive definiteness via S_hat >= S; Section 6.2 identities at a
common q; Chebyshev bound on (0, a+b]; shifted coarse solve; retained-set
definition; positive quadrature weights give K >= 0; reference fixes.
Positioning next to learned multigrid prolongations; cost of the retained
cut band; wording, readability, CN terminology and two notation changes.

Co-Authored-By: Claude Opus 5.5 <noreply@anthropic.com>
Claude-Session: https://claude.ai/code/session_0114mFUC9kQKF8s1RT519QXM
</commit_message>
<xml_diff>
--- a/docs/paper_p1/word/P1_supp_CN.docx
+++ b/docs/paper_p1/word/P1_supp_CN.docx
@@ -30,7 +30,7 @@
         <w:rPr>
           <w:rFonts w:hint="eastAsia"/>
         </w:rPr>
-        <w:t xml:space="preserve">2）一致；下方索引还给出了各变体在数据存档中的记录标识符。</w:t>
+        <w:t xml:space="preserve">3）一致；下方索引还给出了各变体在数据存档中的记录标识符。</w:t>
       </w:r>
     </w:p>
     <w:p>
@@ -2291,7 +2291,7 @@
         <w:t xml:space="preserve">训练设置（表</w:t>
       </w:r>
       <w:r>
-        <w:t xml:space="preserve"> 2 </w:t>
+        <w:t xml:space="preserve"> 3 </w:t>
       </w:r>
       <w:r>
         <w:rPr>
@@ -4822,7 +4822,7 @@
         <w:rPr>
           <w:rFonts w:hint="eastAsia"/>
         </w:rPr>
-        <w:t xml:space="preserve">个自由度；活动自由度中位数为</w:t>
+        <w:t xml:space="preserve">个自由度；激活自由度中位数为</w:t>
       </w:r>
       <w:r>
         <w:t xml:space="preserve"> </w:t>
@@ -10603,7 +10603,7 @@
         <w:rPr>
           <w:rFonts w:hint="eastAsia"/>
         </w:rPr>
-        <w:t xml:space="preserve">(13)）。累积曲线、节点力结果和方向百分位数见图</w:t>
+        <w:t xml:space="preserve">(15)）。累积曲线、节点力结果和方向百分位数见图</w:t>
       </w:r>
       <w:r>
         <w:t xml:space="preserve"> 5。</w:t>
@@ -12322,7 +12322,7 @@
         <w:t xml:space="preserve">步结果即表</w:t>
       </w:r>
       <w:r>
-        <w:t xml:space="preserve"> 3 </w:t>
+        <w:t xml:space="preserve"> 4 </w:t>
       </w:r>
       <w:r>
         <w:rPr>
@@ -12339,7 +12339,7 @@
         <w:rPr>
           <w:rFonts w:hint="eastAsia"/>
         </w:rPr>
-        <w:t xml:space="preserve">调和初始场是保留位移变形部分的图调和延拓。该图以胞的活动节点为顶点，将每个活动单元</w:t>
+        <w:t xml:space="preserve">调和初始场是保留位移变形部分的图调和延拓。该图以胞的激活节点为顶点，将每个激活单元</w:t>
       </w:r>
       <w:r>
         <w:t xml:space="preserve"> 27 </w:t>
@@ -22860,7 +22860,7 @@
         <w:rPr>
           <w:rFonts w:hint="eastAsia"/>
         </w:rPr>
-        <w:t xml:space="preserve">；每个数量级减小约百倍，这正是中心差分的二阶截断误差，与这些胞上导数在固定活动集下于</w:t>
+        <w:t xml:space="preserve">；每个数量级减小约百倍，这正是中心差分的二阶截断误差，与这些胞上导数在固定激活集下于</w:t>
       </w:r>
       <w:r>
         <w:t xml:space="preserve"> </w:t>
@@ -23715,7 +23715,7 @@
         <w:t xml:space="preserve">的压缩性（第</w:t>
       </w:r>
       <w:r>
-        <w:t xml:space="preserve"> 4.3 </w:t>
+        <w:t xml:space="preserve"> 4.4 </w:t>
       </w:r>
       <w:r>
         <w:rPr>
@@ -27102,7 +27102,7 @@
         <w:t xml:space="preserve">本说明定义表</w:t>
       </w:r>
       <w:r>
-        <w:t xml:space="preserve"> 5 </w:t>
+        <w:t xml:space="preserve"> 6 </w:t>
       </w:r>
       <w:r>
         <w:rPr>
@@ -27780,7 +27780,7 @@
         <w:t xml:space="preserve">，后者通过在固定的恢复场下对矩积分进行反向模式微分得到。其算术精度与表</w:t>
       </w:r>
       <w:r>
-        <w:t xml:space="preserve"> 1 </w:t>
+        <w:t xml:space="preserve"> 2 </w:t>
       </w:r>
       <w:r>
         <w:rPr>
@@ -28249,7 +28249,7 @@
         <w:rPr>
           <w:rFonts w:hint="eastAsia"/>
         </w:rPr>
-        <w:t xml:space="preserve">在建立阶段内存超过</w:t>
+        <w:t xml:space="preserve">在设置内存超过</w:t>
       </w:r>
       <w:r>
         <w:t xml:space="preserve"> 90 GiB。</w:t>
@@ -28363,7 +28363,7 @@
         <w:t xml:space="preserve">的内存见表</w:t>
       </w:r>
       <w:r>
-        <w:t xml:space="preserve"> 5。</w:t>
+        <w:t xml:space="preserve"> 6。</w:t>
       </w:r>
     </w:p>
     <w:p>
@@ -28591,7 +28591,7 @@
         <w:t xml:space="preserve">总自由度与自由保留自由度：见表</w:t>
       </w:r>
       <w:r>
-        <w:t xml:space="preserve"> 5。</w:t>
+        <w:t xml:space="preserve"> 6。</w:t>
       </w:r>
     </w:p>
     <w:p>
@@ -29746,7 +29746,7 @@
         <w:t xml:space="preserve">线程的总计即表</w:t>
       </w:r>
       <w:r>
-        <w:t xml:space="preserve"> 5 </w:t>
+        <w:t xml:space="preserve"> 6 </w:t>
       </w:r>
       <w:r>
         <w:rPr>
@@ -30247,7 +30247,7 @@
         <w:t xml:space="preserve">凝聚求解：私有消元、界面分解与求解，以及六个载荷的回代。表</w:t>
       </w:r>
       <w:r>
-        <w:t xml:space="preserve"> 5 </w:t>
+        <w:t xml:space="preserve"> 6 </w:t>
       </w:r>
       <w:r>
         <w:rPr>
@@ -30742,7 +30742,16 @@
         <w:rPr>
           <w:rFonts w:hint="eastAsia"/>
         </w:rPr>
-        <w:t xml:space="preserve">5（GPU</w:t>
+        <w:t xml:space="preserve">6；各阶段之和比总计少</w:t>
+      </w:r>
+      <w:r>
+        <w:t xml:space="preserve"> 0.2–0.5 </w:t>
+      </w:r>
+      <w:r>
+        <w:rPr>
+          <w:rFonts w:hint="eastAsia"/>
+        </w:rPr>
+        <w:t xml:space="preserve">s，差额为阶段之间的簿记开销（GPU</w:t>
       </w:r>
       <w:r>
         <w:t xml:space="preserve"> </w:t>
@@ -30810,7 +30819,7 @@
         <w:rPr>
           <w:rFonts w:hint="eastAsia"/>
         </w:rPr>
-        <w:t xml:space="preserve">进程）：建立阶段、共轭梯度与</w:t>
+        <w:t xml:space="preserve">进程）：设置、共轭梯度与</w:t>
       </w:r>
       <w:r>
         <w:t xml:space="preserve"> BDDC </w:t>
@@ -30866,7 +30875,7 @@
               <w:rPr>
                 <w:rFonts w:hint="eastAsia"/>
               </w:rPr>
-              <w:t xml:space="preserve">GAMG：建立阶段</w:t>
+              <w:t xml:space="preserve">GAMG：设置</w:t>
             </w:r>
           </w:p>
         </w:tc>
@@ -30967,7 +30976,7 @@
               <w:rPr>
                 <w:rFonts w:hint="eastAsia"/>
               </w:rPr>
-              <w:t xml:space="preserve">，含建立阶段：3</w:t>
+              <w:t xml:space="preserve">，含设置：3</w:t>
             </w:r>
             <w:r>
               <w:t xml:space="preserve"> </w:t>
@@ -31057,7 +31066,7 @@
               <w:rPr>
                 <w:rFonts w:hint="eastAsia"/>
               </w:rPr>
-              <w:t xml:space="preserve">BoomerAMG：建立阶段</w:t>
+              <w:t xml:space="preserve">BoomerAMG：设置</w:t>
             </w:r>
             <w:r>
               <w:t xml:space="preserve"> / </w:t>
@@ -31066,7 +31075,39 @@
               <w:rPr>
                 <w:rFonts w:hint="eastAsia"/>
               </w:rPr>
-              <w:t xml:space="preserve">迭代次数</w:t>
+              <w:t xml:space="preserve">至</w:t>
+            </w:r>
+            <w:r>
+              <w:t xml:space="preserve"> </w:t>
+            </w:r>
+            <m:oMath>
+              <m:sSup>
+                <m:e>
+                  <m:r>
+                    <m:t>10</m:t>
+                  </m:r>
+                </m:e>
+                <m:sup>
+                  <m:r>
+                    <m:rPr>
+                      <m:sty m:val="p"/>
+                    </m:rPr>
+                    <m:t>−</m:t>
+                  </m:r>
+                  <m:r>
+                    <m:t>4</m:t>
+                  </m:r>
+                </m:sup>
+              </m:sSup>
+            </m:oMath>
+            <w:r>
+              <w:t xml:space="preserve"> </w:t>
+            </w:r>
+            <w:r>
+              <w:rPr>
+                <w:rFonts w:hint="eastAsia"/>
+              </w:rPr>
+              <w:t xml:space="preserve">的迭代次数</w:t>
             </w:r>
             <w:r>
               <w:t xml:space="preserve"> / </w:t>
@@ -31248,7 +31289,7 @@
               <w:pStyle w:val="Compact"/>
             </w:pPr>
             <w:r>
-              <w:t xml:space="preserve">96.6 / 329–336 / 535–615</w:t>
+              <w:t xml:space="preserve">96.6 / 250–260 / 405–481</w:t>
             </w:r>
           </w:p>
         </w:tc>
@@ -31341,7 +31382,16 @@
         <w:rPr>
           <w:rFonts w:hint="eastAsia"/>
         </w:rPr>
-        <w:t xml:space="preserve">相同，先三个一致面力，后三个随机载荷。不含所有精确路线共有的胞设置与装配（表</w:t>
+        <w:t xml:space="preserve">相同，先三个一致面力，后三个随机载荷。不含取自路线</w:t>
+      </w:r>
+      <w:r>
+        <w:t xml:space="preserve"> </w:t>
+      </w:r>
+      <w:r>
+        <w:rPr>
+          <w:rFonts w:hint="eastAsia"/>
+        </w:rPr>
+        <w:t xml:space="preserve">(a)、为所有细尺度路线共有的胞设置与装配以及整体装配与缩放（表</w:t>
       </w:r>
       <w:r>
         <w:t xml:space="preserve"> </w:t>
@@ -34348,7 +34398,7 @@
         <w:rPr>
           <w:rFonts w:hint="eastAsia"/>
         </w:rPr>
-        <w:t xml:space="preserve">G.1）、活动单元集合或粗分解的对角平移（附录</w:t>
+        <w:t xml:space="preserve">G.1）、激活单元集合或粗分解的对角平移（附录</w:t>
       </w:r>
       <w:r>
         <w:t xml:space="preserve"> </w:t>
@@ -36498,7 +36548,7 @@
         <w:rPr>
           <w:rFonts w:hint="eastAsia"/>
         </w:rPr>
-        <w:t xml:space="preserve">个至少改变一个离散选择，其中多数为活动单元、ghost</w:t>
+        <w:t xml:space="preserve">个至少改变一个离散选择，其中多数为激活单元、ghost</w:t>
       </w:r>
       <w:r>
         <w:t xml:space="preserve"> </w:t>
@@ -36952,7 +37002,7 @@
               <w:rPr>
                 <w:rFonts w:hint="eastAsia"/>
               </w:rPr>
-              <w:t xml:space="preserve">个层级各自的限制与延拓（6</w:t>
+              <w:t xml:space="preserve">个层级各自的限制与插值（6</w:t>
             </w:r>
             <w:r>
               <w:t xml:space="preserve"> </w:t>
@@ -37602,7 +37652,7 @@
               <w:rPr>
                 <w:rFonts w:hint="eastAsia"/>
               </w:rPr>
-              <w:t xml:space="preserve">10,848；限制/延拓头</w:t>
+              <w:t xml:space="preserve">10,848；限制/插值头</w:t>
             </w:r>
             <w:r>
               <w:t xml:space="preserve"> </w:t>
@@ -38184,7 +38234,7 @@
         <w:t xml:space="preserve">在迭代之间会改变其离散模型（S6.4）。设计迭代与表</w:t>
       </w:r>
       <w:r>
-        <w:t xml:space="preserve"> 5 </w:t>
+        <w:t xml:space="preserve"> 6 </w:t>
       </w:r>
       <w:r>
         <w:rPr>
@@ -38238,7 +38288,7 @@
         <w:t xml:space="preserve">ST17c），而表</w:t>
       </w:r>
       <w:r>
-        <w:t xml:space="preserve"> 5 </w:t>
+        <w:t xml:space="preserve"> 6 </w:t>
       </w:r>
       <w:r>
         <w:rPr>
@@ -39981,7 +40031,7 @@
               <w:t xml:space="preserve">次迭代），算术精度与表</w:t>
             </w:r>
             <w:r>
-              <w:t xml:space="preserve"> 5 </w:t>
+              <w:t xml:space="preserve"> 6 </w:t>
             </w:r>
             <w:r>
               <w:rPr>
@@ -43634,7 +43684,7 @@
         <w:rPr>
           <w:rFonts w:hint="eastAsia"/>
         </w:rPr>
-        <w:t xml:space="preserve">6。各阶段平均时间对所有迭代取平均；迭代</w:t>
+        <w:t xml:space="preserve">7。各阶段平均时间对所有迭代取平均；迭代</w:t>
       </w:r>
       <w:r>
         <w:t xml:space="preserve"> 0 </w:t>
@@ -45618,7 +45668,7 @@
         <w:rPr>
           <w:rFonts w:hint="eastAsia"/>
         </w:rPr>
-        <w:t xml:space="preserve">6。图</w:t>
+        <w:t xml:space="preserve">7。图</w:t>
       </w:r>
       <w:r>
         <w:t xml:space="preserve"> 13a,b </w:t>
@@ -48383,7 +48433,7 @@
               <w:rPr>
                 <w:rFonts w:hint="eastAsia"/>
               </w:rPr>
-              <w:t xml:space="preserve">活动单元；ghost</w:t>
+              <w:t xml:space="preserve">激活单元；ghost</w:t>
             </w:r>
             <w:r>
               <w:t xml:space="preserve"> </w:t>
@@ -48766,7 +48816,7 @@
         <w:rPr>
           <w:rFonts w:hint="eastAsia"/>
         </w:rPr>
-        <w:t xml:space="preserve">最大值：活动单元和</w:t>
+        <w:t xml:space="preserve">最大值：激活单元和</w:t>
       </w:r>
       <w:r>
         <w:t xml:space="preserve"> ghost </w:t>
@@ -48811,7 +48861,7 @@
         <w:rPr>
           <w:rFonts w:hint="eastAsia"/>
         </w:rPr>
-        <w:t xml:space="preserve">步）仅记录了活动单元和保留自由度，结果为</w:t>
+        <w:t xml:space="preserve">步）仅记录了激活单元和保留自由度，结果为</w:t>
       </w:r>
       <w:r>
         <w:t xml:space="preserve"> 2 / 8 / 8 </w:t>

</xml_diff>

<commit_message>
P1: address the 2026-10-05 review (abstract reference, Figure 2 equation label, BDDC wording, per-DOF output networks, B.2 kernel condition)
- Abstract: the 2.4% comparison is attributed to the clamped 24-cell layer.
- Figure 2: the construction of the extension is Eq. (14); figure regenerated.
- BDDC: local factorisation cost of the configuration used, not a lower
  bound; the 90 GiB refers to the eight-process MUMPS setup.
- Per-DOF output networks: the issue is an output dimension fixed by one
  retained set; Table 1 row 3 limited to the trained domain.
- Appendix B.2: kernel statement refers to the connectivity condition and
  the numerical-kernel assumption of Appendix A.1.
EN and CN; PDFs, Word files and advisor deck rebuilt.

Co-Authored-By: Claude Opus 5.5 <noreply@anthropic.com>
Claude-Session: https://claude.ai/code/session_0114mFUC9kQKF8s1RT519QXM
</commit_message>
<xml_diff>
--- a/docs/paper_p1/word/P1_supp_CN.docx
+++ b/docs/paper_p1/word/P1_supp_CN.docx
@@ -28213,7 +28213,7 @@
         <w:rPr>
           <w:rFonts w:hint="eastAsia"/>
         </w:rPr>
-        <w:t xml:space="preserve">的平移。这些分解的总时间是</w:t>
+        <w:t xml:space="preserve">的平移。这些分解的总时间是该配置下采用精确局部求解的</w:t>
       </w:r>
       <w:r>
         <w:t xml:space="preserve"> BDDC </w:t>
@@ -28222,7 +28222,7 @@
         <w:rPr>
           <w:rFonts w:hint="eastAsia"/>
         </w:rPr>
-        <w:t xml:space="preserve">每个几何成本的下界，不含其约束</w:t>
+        <w:t xml:space="preserve">局部分解成本的参照，不含局部</w:t>
       </w:r>
       <w:r>
         <w:t xml:space="preserve"> Neumann </w:t>
@@ -28231,7 +28231,7 @@
         <w:rPr>
           <w:rFonts w:hint="eastAsia"/>
         </w:rPr>
-        <w:t xml:space="preserve">求解、粗问题和迭代。以</w:t>
+        <w:t xml:space="preserve">问题中主约束与零空间的处理、粗问题和迭代。以</w:t>
       </w:r>
       <w:r>
         <w:t xml:space="preserve"> MUMPS </w:t>

</xml_diff>

<commit_message>
Rebuild EN/CN PDFs, advisor set, figure index and Word files after the review fixes
Co-Authored-By: Claude Opus 5.5 <noreply@anthropic.com>
Claude-Session: https://claude.ai/code/session_0114mFUC9kQKF8s1RT519QXM
</commit_message>
<xml_diff>
--- a/docs/paper_p1/word/P1_supp_CN.docx
+++ b/docs/paper_p1/word/P1_supp_CN.docx
@@ -2813,115 +2813,7 @@
         <w:rPr>
           <w:rFonts w:hint="eastAsia"/>
         </w:rPr>
-        <w:t xml:space="preserve">计至最后一个训练步，基础网络的训练在</w:t>
-      </w:r>
-      <w:r>
-        <w:t xml:space="preserve"> GPU </w:t>
-      </w:r>
-      <w:r>
-        <w:rPr>
-          <w:rFonts w:hint="eastAsia"/>
-        </w:rPr>
-        <w:t xml:space="preserve">上（第</w:t>
-      </w:r>
-      <w:r>
-        <w:t xml:space="preserve"> 5.1 </w:t>
-      </w:r>
-      <w:r>
-        <w:rPr>
-          <w:rFonts w:hint="eastAsia"/>
-        </w:rPr>
-        <w:t xml:space="preserve">节）耗时</w:t>
-      </w:r>
-      <w:r>
-        <w:t xml:space="preserve"> 4.6 </w:t>
-      </w:r>
-      <w:r>
-        <w:rPr>
-          <w:rFonts w:hint="eastAsia"/>
-        </w:rPr>
-        <w:t xml:space="preserve">h，NICE</w:t>
-      </w:r>
-      <w:r>
-        <w:t xml:space="preserve"> </w:t>
-      </w:r>
-      <w:r>
-        <w:rPr>
-          <w:rFonts w:hint="eastAsia"/>
-        </w:rPr>
-        <w:t xml:space="preserve">的继续训练耗时</w:t>
-      </w:r>
-      <w:r>
-        <w:t xml:space="preserve"> 3.5 </w:t>
-      </w:r>
-      <w:r>
-        <w:rPr>
-          <w:rFonts w:hint="eastAsia"/>
-        </w:rPr>
-        <w:t xml:space="preserve">h；若计入全部选择评估，则分别为</w:t>
-      </w:r>
-      <w:r>
-        <w:t xml:space="preserve"> 5.0 h </w:t>
-      </w:r>
-      <w:r>
-        <w:rPr>
-          <w:rFonts w:hint="eastAsia"/>
-        </w:rPr>
-        <w:t xml:space="preserve">和</w:t>
-      </w:r>
-      <w:r>
-        <w:t xml:space="preserve"> 4.8 </w:t>
-      </w:r>
-      <w:r>
-        <w:rPr>
-          <w:rFonts w:hint="eastAsia"/>
-        </w:rPr>
-        <w:t xml:space="preserve">h。训练期间</w:t>
-      </w:r>
-      <w:r>
-        <w:t xml:space="preserve"> GPU </w:t>
-      </w:r>
-      <w:r>
-        <w:rPr>
-          <w:rFonts w:hint="eastAsia"/>
-        </w:rPr>
-        <w:t xml:space="preserve">峰值显存为</w:t>
-      </w:r>
-      <w:r>
-        <w:t xml:space="preserve"> 29.6 </w:t>
-      </w:r>
-      <w:r>
-        <w:rPr>
-          <w:rFonts w:hint="eastAsia"/>
-        </w:rPr>
-        <w:t xml:space="preserve">GiB。基础网络由此前三个训练阶段（合计</w:t>
-      </w:r>
-      <w:r>
-        <w:t xml:space="preserve"> 7.5 GPU </w:t>
-      </w:r>
-      <w:r>
-        <w:rPr>
-          <w:rFonts w:hint="eastAsia"/>
-        </w:rPr>
-        <w:t xml:space="preserve">小时）得到的参数初始化。NICE</w:t>
-      </w:r>
-      <w:r>
-        <w:t xml:space="preserve"> </w:t>
-      </w:r>
-      <w:r>
-        <w:rPr>
-          <w:rFonts w:hint="eastAsia"/>
-        </w:rPr>
-        <w:t xml:space="preserve">的离线成本约为</w:t>
-      </w:r>
-      <w:r>
-        <w:t xml:space="preserve"> 60 GPU </w:t>
-      </w:r>
-      <w:r>
-        <w:rPr>
-          <w:rFonts w:hint="eastAsia"/>
-        </w:rPr>
-        <w:t xml:space="preserve">小时，包括这些阶段、上述两次运行（含其选择评估），以及测试位移集与精确灵敏度的生成。后者涵盖数据划分中的</w:t>
+        <w:t xml:space="preserve">基础网络由此前三个训练阶段得到的参数初始化。数据划分共包含</w:t>
       </w:r>
       <w:r>
         <w:t xml:space="preserve"> 691 </w:t>
@@ -2948,7 +2840,7 @@
         <w:rPr>
           <w:rFonts w:hint="eastAsia"/>
         </w:rPr>
-        <w:t xml:space="preserve">个验证几何（验证几何包括表</w:t>
+        <w:t xml:space="preserve">个验证几何，验证几何包括表</w:t>
       </w:r>
       <w:r>
         <w:t xml:space="preserve"> ST02 </w:t>
@@ -2966,25 +2858,7 @@
         <w:rPr>
           <w:rFonts w:hint="eastAsia"/>
         </w:rPr>
-        <w:t xml:space="preserve">个），耗时约</w:t>
-      </w:r>
-      <w:r>
-        <w:t xml:space="preserve"> 42 GPU </w:t>
-      </w:r>
-      <w:r>
-        <w:rPr>
-          <w:rFonts w:hint="eastAsia"/>
-        </w:rPr>
-        <w:t xml:space="preserve">小时（第</w:t>
-      </w:r>
-      <w:r>
-        <w:t xml:space="preserve"> 5.1 </w:t>
-      </w:r>
-      <w:r>
-        <w:rPr>
-          <w:rFonts w:hint="eastAsia"/>
-        </w:rPr>
-        <w:t xml:space="preserve">节）。</w:t>
+        <w:t xml:space="preserve">个。</w:t>
       </w:r>
     </w:p>
     <w:p>
@@ -23935,16 +23809,7 @@
         <w:rPr>
           <w:rFonts w:hint="eastAsia"/>
         </w:rPr>
-        <w:t xml:space="preserve">，相当于在主自由度位移空间的一个子空间上求解；边界空间嵌套时，Ritz</w:t>
-      </w:r>
-      <w:r>
-        <w:t xml:space="preserve"> </w:t>
-      </w:r>
-      <w:r>
-        <w:rPr>
-          <w:rFonts w:hint="eastAsia"/>
-        </w:rPr>
-        <w:t xml:space="preserve">柔度单调不减。修正保持全部主自由度不变，并改变</w:t>
+        <w:t xml:space="preserve">，相当于在主自由度位移空间的一个子空间上求解；由最小势能原理，当边界空间扩大为包含原空间的更大空间时，该限制解的柔度不减小。修正保持全部主自由度不变，并改变</w:t>
       </w:r>
       <w:r>
         <w:t xml:space="preserve"> </w:t>
@@ -27624,7 +27489,7 @@
         <w:rPr>
           <w:rFonts w:hint="eastAsia"/>
         </w:rPr>
-        <w:t xml:space="preserve">即整体点阵直接求解，将每个胞元在主自由度与内部自由度上的完整切割胞元刚度装配为一个全局矩阵。主自由度的编号与耦合方式与学习点阵完全相同，固支、自由自由度集合与载荷向量也相同。每个胞元的内部自由度排在自由主自由度之后。该矩阵按其对角线进行对称缩放，并在</w:t>
+        <w:t xml:space="preserve">即整体点阵直接求解，将每个胞元在主自由度与内部自由度上的完整切割胞元刚度装配为一个全局矩阵。主自由度的编号与耦合方式与学习点阵完全相同，固支、未约束自由度集合与载荷向量也相同。每个胞元的内部自由度排在未约束主自由度之后。该矩阵按其对角线进行对称缩放，并在</w:t>
       </w:r>
       <w:r>
         <w:t xml:space="preserve"> CPU </w:t>
@@ -28415,7 +28280,7 @@
         <w:rPr>
           <w:rFonts w:hint="eastAsia"/>
         </w:rPr>
-        <w:t xml:space="preserve">矩阵为整个胞元在其自由自由度上的刚度。二者均按路线</w:t>
+        <w:t xml:space="preserve">矩阵为整个胞元在其未约束自由度上的刚度。二者均按路线</w:t>
       </w:r>
       <w:r>
         <w:t xml:space="preserve"> (a) </w:t>
@@ -28722,7 +28587,7 @@
               <w:rPr>
                 <w:rFonts w:hint="eastAsia"/>
               </w:rPr>
-              <w:t xml:space="preserve">胞元表面以外的切割平面单元自由度（占自由主自由度的比例）</w:t>
+              <w:t xml:space="preserve">胞元表面以外的切割平面单元自由度（占未约束主自由度的比例）</w:t>
             </w:r>
           </w:p>
         </w:tc>
@@ -28876,7 +28741,7 @@
         <w:rPr>
           <w:rFonts w:hint="eastAsia"/>
         </w:rPr>
-        <w:t xml:space="preserve">总自由度数与自由主自由度数：见表</w:t>
+        <w:t xml:space="preserve">总自由度数与未约束主自由度数：见表</w:t>
       </w:r>
       <w:r>
         <w:t xml:space="preserve"> 5。</w:t>
@@ -32526,7 +32391,7 @@
         <w:rPr>
           <w:rFonts w:hint="eastAsia"/>
         </w:rPr>
-        <w:t xml:space="preserve">，定义在自由主自由度上。刚度块细层作用为</w:t>
+        <w:t xml:space="preserve">，定义在未约束主自由度上。刚度块细层作用为</w:t>
       </w:r>
       <w:r>
         <w:t xml:space="preserve"> </w:t>
@@ -34630,7 +34495,7 @@
         <w:rPr>
           <w:rFonts w:hint="eastAsia"/>
         </w:rPr>
-        <w:t xml:space="preserve">处重建每个胞元的凝聚刚度。重建所得刚度在</w:t>
+        <w:t xml:space="preserve">处重建每个胞元的凝聚刚度矩阵。重建所得刚度在</w:t>
       </w:r>
       <w:r>
         <w:t xml:space="preserve"> </w:t>
@@ -37281,7 +37146,7 @@
               <w:rPr>
                 <w:rFonts w:hint="eastAsia"/>
               </w:rPr>
-              <w:t xml:space="preserve">个弱区域层各自的聚集与散布角色（48</w:t>
+              <w:t xml:space="preserve">个弱区域层各自的收集与散布角色（48</w:t>
             </w:r>
             <w:r>
               <w:t xml:space="preserve"> </w:t>
@@ -37856,7 +37721,7 @@
               <w:rPr>
                 <w:rFonts w:hint="eastAsia"/>
               </w:rPr>
-              <w:t xml:space="preserve">的注释），其中第一个阶段采用上述随机初始化；各延续训练均从基础网络的选定参数开始</w:t>
+              <w:t xml:space="preserve">的注释），其中第一个阶段采用上述随机初始化；各继续训练变体均从基础网络的选定参数开始</w:t>
             </w:r>
           </w:p>
         </w:tc>
@@ -39031,7 +38896,7 @@
               <w:rPr>
                 <w:rFonts w:hint="eastAsia"/>
               </w:rPr>
-              <w:t xml:space="preserve">给出的近似柔度完整导数。精确孪生：由精确位移场并结合式</w:t>
+              <w:t xml:space="preserve">给出的近似柔度完整导数。精确对照运行：由精确位移场并结合式</w:t>
             </w:r>
             <w:r>
               <w:t xml:space="preserve"> (H.3) </w:t>
@@ -39131,7 +38996,7 @@
               <w:rPr>
                 <w:rFonts w:hint="eastAsia"/>
               </w:rPr>
-              <w:t xml:space="preserve">所有胞元的零阶单元矩之和（离散模型的材料体积），其导数由同一次反向传播得到（精确孪生：式</w:t>
+              <w:t xml:space="preserve">所有胞元的零阶单元矩之和（离散模型的材料体积），其导数由同一次反向传播得到（精确对照运行：式</w:t>
             </w:r>
             <w:r>
               <w:t xml:space="preserve"> </w:t>
@@ -40369,7 +40234,7 @@
               <w:rPr>
                 <w:rFonts w:hint="eastAsia"/>
               </w:rPr>
-              <w:t xml:space="preserve">，则终止该运行。精确孪生：每个胞元的稠密精确凝聚矩阵，装配后求解至</w:t>
+              <w:t xml:space="preserve">，则终止该运行。精确对照运行：每个胞元的稠密精确凝聚矩阵，装配后求解至</w:t>
             </w:r>
             <w:r>
               <w:t xml:space="preserve"> </w:t>
@@ -40571,7 +40436,7 @@
               <w:rPr>
                 <w:rFonts w:hint="eastAsia"/>
               </w:rPr>
-              <w:t xml:space="preserve">均从零开始求解。精确孪生：冷启动</w:t>
+              <w:t xml:space="preserve">均从零开始求解。精确对照运行：冷启动</w:t>
             </w:r>
           </w:p>
         </w:tc>
@@ -40646,7 +40511,7 @@
               <w:rPr>
                 <w:rFonts w:hint="eastAsia"/>
               </w:rPr>
-              <w:t xml:space="preserve">期间胞元常驻；规模演示：4</w:t>
+              <w:t xml:space="preserve">期间胞元常驻；规模算例：4</w:t>
             </w:r>
             <w:r>
               <w:t xml:space="preserve"> </w:t>
@@ -41008,7 +40873,7 @@
         <w:rPr>
           <w:rFonts w:hint="eastAsia"/>
         </w:rPr>
-        <w:t xml:space="preserve">优化、精确孪生与精确检验</w:t>
+        <w:t xml:space="preserve">优化、精确对照运行与精确检验</w:t>
       </w:r>
     </w:p>
     <w:p>
@@ -41118,7 +40983,7 @@
         <w:rPr>
           <w:rFonts w:hint="eastAsia"/>
         </w:rPr>
-        <w:t xml:space="preserve">方向的面力载荷作用。精确孪生从相同的初始设计出发，采用相同的设置、约束和几何重新生成运行同一优化，但使用精确凝聚（表</w:t>
+        <w:t xml:space="preserve">方向的面力载荷作用。精确对照运行从相同的初始设计出发，采用相同的设置、约束和几何重新生成运行同一优化，但使用精确凝聚（表</w:t>
       </w:r>
       <w:r>
         <w:t xml:space="preserve"> </w:t>
@@ -41163,7 +41028,7 @@
         <w:rPr>
           <w:rFonts w:hint="eastAsia"/>
         </w:rPr>
-        <w:t xml:space="preserve">ST17b）。孪生运行用于验证，不作为成本基准；精确路线与学习路线的成本比较见第</w:t>
+        <w:t xml:space="preserve">ST17b）。对照运行用于验证，不作为成本基准；精确路线与学习路线的成本比较见第</w:t>
       </w:r>
       <w:r>
         <w:t xml:space="preserve"> 5.9 </w:t>
@@ -41210,7 +41075,7 @@
         <w:rPr>
           <w:rFonts w:hint="eastAsia"/>
         </w:rPr>
-        <w:t xml:space="preserve">优化、精确孪生与精确检验</w:t>
+        <w:t xml:space="preserve">优化、精确对照运行与精确检验</w:t>
       </w:r>
     </w:p>
     <w:p>
@@ -41230,7 +41095,8 @@
     <w:tbl>
       <w:tblPr>
         <w:tblStyle w:val="Table"/>
-        <w:tblW w:type="auto" w:w="0"/>
+        <w:tblW w:type="pct" w:w="5000"/>
+        <w:tblLayout w:type="fixed"/>
         <w:tblLook w:firstRow="1" w:lastRow="0" w:firstColumn="0" w:lastColumn="0" w:noHBand="0" w:noVBand="0" w:val="0020"/>
       </w:tblPr>
       <w:tblGrid>
@@ -41298,7 +41164,7 @@
               <w:rPr>
                 <w:rFonts w:hint="eastAsia"/>
               </w:rPr>
-              <w:t xml:space="preserve">，精确孪生</w:t>
+              <w:t xml:space="preserve">，精确对照运行</w:t>
             </w:r>
           </w:p>
         </w:tc>
@@ -41315,7 +41181,7 @@
               <w:rPr>
                 <w:rFonts w:hint="eastAsia"/>
               </w:rPr>
-              <w:t xml:space="preserve">相对孪生（%）</w:t>
+              <w:t xml:space="preserve">相对对照运行（%）</w:t>
             </w:r>
           </w:p>
         </w:tc>
@@ -42454,7 +42320,7 @@
         <w:rPr>
           <w:rFonts w:hint="eastAsia"/>
         </w:rPr>
-        <w:t xml:space="preserve">相对孪生：同一迭代序号下的</w:t>
+        <w:t xml:space="preserve">相对对照运行：同一迭代序号下的</w:t>
       </w:r>
       <w:r>
         <w:t xml:space="preserve"> </w:t>
@@ -43589,7 +43455,7 @@
               <w:rPr>
                 <w:rFonts w:hint="eastAsia"/>
               </w:rPr>
-              <w:t xml:space="preserve">精确孪生</w:t>
+              <w:t xml:space="preserve">精确对照运行</w:t>
             </w:r>
           </w:p>
         </w:tc>
@@ -43933,7 +43799,7 @@
         <w:rPr>
           <w:rFonts w:hint="eastAsia"/>
         </w:rPr>
-        <w:t xml:space="preserve">设计的精确柔度与孪生设计精确柔度的相对差为</w:t>
+        <w:t xml:space="preserve">设计的精确柔度与对照运行设计精确柔度的相对差为</w:t>
       </w:r>
       <w:r>
         <w:t xml:space="preserve"> </w:t>
@@ -48658,7 +48524,7 @@
         <w:rPr>
           <w:rFonts w:hint="eastAsia"/>
         </w:rPr>
-        <w:t xml:space="preserve">为所施加扰动引起的角点参数最大变化；没有扰动顶点被截断至边界。精确孪生和均匀化设计的分析均无需回退。</w:t>
+        <w:t xml:space="preserve">为所施加扰动引起的角点参数最大变化；没有扰动顶点被截断至边界。精确对照运行和均匀化设计的分析均无需回退。</w:t>
       </w:r>
     </w:p>
     <w:p>
@@ -48786,21 +48652,21 @@
               <w:rPr>
                 <w:rFonts w:hint="eastAsia"/>
               </w:rPr>
-              <w:t xml:space="preserve">弱区单元模板</w:t>
-            </w:r>
-          </w:p>
-        </w:tc>
-        <w:tc>
-          <w:tcPr/>
-          <w:p>
-            <w:pPr>
-              <w:pStyle w:val="Compact"/>
-            </w:pPr>
-            <w:r>
-              <w:rPr>
-                <w:rFonts w:hint="eastAsia"/>
-              </w:rPr>
-              <w:t xml:space="preserve">弱区面模板</w:t>
+              <w:t xml:space="preserve">弱区域单元模板</w:t>
+            </w:r>
+          </w:p>
+        </w:tc>
+        <w:tc>
+          <w:tcPr/>
+          <w:p>
+            <w:pPr>
+              <w:pStyle w:val="Compact"/>
+            </w:pPr>
+            <w:r>
+              <w:rPr>
+                <w:rFonts w:hint="eastAsia"/>
+              </w:rPr>
+              <w:t xml:space="preserve">弱区域面模板</w:t>
             </w:r>
           </w:p>
         </w:tc>
@@ -49113,7 +48979,7 @@
         <w:rPr>
           <w:rFonts w:hint="eastAsia"/>
         </w:rPr>
-        <w:t xml:space="preserve">罚项面（计数相同）、主自由度，以及由网络的二值节点指示量标记的切割平面单元节点和弱连接节点；此外还有为弱区层选取的单元模板和面模板（附录</w:t>
+        <w:t xml:space="preserve">罚项面（计数相同）、主自由度，以及由网络的二值节点指示量标记的切割平面单元节点和弱连接节点；此外还有为弱区域层选取的单元模板和面模板（附录</w:t>
       </w:r>
       <w:r>
         <w:t xml:space="preserve"> </w:t>
@@ -49131,7 +48997,7 @@
         <w:rPr>
           <w:rFonts w:hint="eastAsia"/>
         </w:rPr>
-        <w:t xml:space="preserve">F.1）。不改变计数的变化无法被检测到，因此这些数字是下界。精确孪生（8</w:t>
+        <w:t xml:space="preserve">F.1）。不改变计数的变化无法被检测到，因此这些数字是下界。精确对照运行（8</w:t>
       </w:r>
       <w:r>
         <w:t xml:space="preserve"> </w:t>
@@ -49175,7 +49041,7 @@
         <w:rPr>
           <w:rFonts w:hint="eastAsia"/>
         </w:rPr>
-        <w:t xml:space="preserve">规模演示与板设计的精确验证</w:t>
+        <w:t xml:space="preserve">规模算例与板设计的精确验证</w:t>
       </w:r>
     </w:p>
     <w:p>
@@ -49188,7 +49054,7 @@
           <w:b/>
           <w:bCs/>
         </w:rPr>
-        <w:t xml:space="preserve">规模演示。</w:t>
+        <w:t xml:space="preserve">规模算例。</w:t>
       </w:r>
       <w:r>
         <w:t xml:space="preserve"> </w:t>
@@ -49430,7 +49296,7 @@
           <w:b/>
           <w:bCs/>
         </w:rPr>
-        <w:t xml:space="preserve">规模演示。</w:t>
+        <w:t xml:space="preserve">规模算例。</w:t>
       </w:r>
       <w:r>
         <w:t xml:space="preserve"> </w:t>
@@ -52846,7 +52712,7 @@
         <w:rPr>
           <w:rFonts w:hint="eastAsia"/>
         </w:rPr>
-        <w:t xml:space="preserve">置于训练循环之内。该变体的检查点仅在</w:t>
+        <w:t xml:space="preserve">置于训练回路之内。该变体的检查点仅在</w:t>
       </w:r>
       <w:r>
         <w:t xml:space="preserve"> P </w:t>
@@ -54986,7 +54852,7 @@
         <w:rPr>
           <w:rFonts w:hint="eastAsia"/>
         </w:rPr>
-        <w:t xml:space="preserve">精确凝聚算子的预条件共轭梯度法（补充说明</w:t>
+        <w:t xml:space="preserve">精确凝聚刚度矩阵的预条件共轭梯度法（补充说明</w:t>
       </w:r>
       <w:r>
         <w:t xml:space="preserve"> </w:t>
@@ -58216,7 +58082,16 @@
         <w:rPr>
           <w:rFonts w:hint="eastAsia"/>
         </w:rPr>
-        <w:t xml:space="preserve">NICE）采用与正文图中相同的标记和颜色；基础网络加修正指在部署时对基础网络施加修正。以确定性的水平偏移区分重叠的观测点。所有子图共用对数误差轴。</w:t>
+        <w:t xml:space="preserve">NICE）采用与正文图及图</w:t>
+      </w:r>
+      <w:r>
+        <w:t xml:space="preserve"> S04 </w:t>
+      </w:r>
+      <w:r>
+        <w:rPr>
+          <w:rFonts w:hint="eastAsia"/>
+        </w:rPr>
+        <w:t xml:space="preserve">中相同的标记和颜色；基础网络加修正指在部署时对基础网络施加修正。以确定性的水平偏移区分重叠的观测点。所有子图共用对数误差轴。</w:t>
       </w:r>
     </w:p>
     <w:p>

</xml_diff>

<commit_message>
R6: rebuild EN/CN PDFs, advisor set, figure index and Word files
Co-Authored-By: Claude Opus 5.5 <noreply@anthropic.com>
Claude-Session: https://claude.ai/code/session_0114mFUC9kQKF8s1RT519QXM
</commit_message>
<xml_diff>
--- a/docs/paper_p1/word/P1_supp_CN.docx
+++ b/docs/paper_p1/word/P1_supp_CN.docx
@@ -30,7 +30,7 @@
         <w:rPr>
           <w:rFonts w:hint="eastAsia"/>
         </w:rPr>
-        <w:t xml:space="preserve">2）一致。未修正延续与平滑训练两个变体未列入该表，其结果在本补充材料中给出。下方索引给出各变体在数据存档中的记录标识符。</w:t>
+        <w:t xml:space="preserve">2）一致。未修正延续与平滑训练两个变体未列入该表，其结果在本补充材料中给出。以下索引给出各变体在数据存档中的记录标识符。</w:t>
       </w:r>
     </w:p>
     <w:p>
@@ -1186,24 +1186,7 @@
         <w:rPr>
           <w:rFonts w:hint="eastAsia"/>
         </w:rPr>
-        <w:t xml:space="preserve">表示切割角</w:t>
-      </w:r>
-      <w:r>
-        <w:t xml:space="preserve"> </w:t>
-      </w:r>
-      <m:oMath>
-        <m:r>
-          <m:t>ϑ</m:t>
-        </m:r>
-      </m:oMath>
-      <w:r>
-        <w:t xml:space="preserve"> </w:t>
-      </w:r>
-      <w:r>
-        <w:rPr>
-          <w:rFonts w:hint="eastAsia"/>
-        </w:rPr>
-        <w:t xml:space="preserve">位于</w:t>
+        <w:t xml:space="preserve">表示</w:t>
       </w:r>
       <w:r>
         <w:t xml:space="preserve"> </w:t>
@@ -1250,7 +1233,24 @@
         <w:rPr>
           <w:rFonts w:hint="eastAsia"/>
         </w:rPr>
-        <w:t xml:space="preserve">的哪一半区间，v0、v1</w:t>
+        <w:t xml:space="preserve">中包含切割角</w:t>
+      </w:r>
+      <w:r>
+        <w:t xml:space="preserve"> </w:t>
+      </w:r>
+      <m:oMath>
+        <m:r>
+          <m:t>ϑ</m:t>
+        </m:r>
+      </m:oMath>
+      <w:r>
+        <w:t xml:space="preserve"> </w:t>
+      </w:r>
+      <w:r>
+        <w:rPr>
+          <w:rFonts w:hint="eastAsia"/>
+        </w:rPr>
+        <w:t xml:space="preserve">的半区间，v0、v1</w:t>
       </w:r>
       <w:r>
         <w:t xml:space="preserve"> </w:t>
@@ -38303,7 +38303,7 @@
         <w:rPr>
           <w:rFonts w:hint="eastAsia"/>
         </w:rPr>
-        <w:t xml:space="preserve">列出了各项设置。移动渐近线法每完成一次分析，即由梯度估计值构造一个凸可分近似。该方法从不沿搜索方向检验</w:t>
+        <w:t xml:space="preserve">列出了各项设置。移动渐近线法每完成一次分析，即由梯度估计值构造一个凸可分近似。该方法不沿搜索方向检验</w:t>
       </w:r>
       <w:r>
         <w:t xml:space="preserve"> </w:t>
@@ -38345,7 +38345,7 @@
         <w:rPr>
           <w:rFonts w:hint="eastAsia"/>
         </w:rPr>
-        <w:t xml:space="preserve">残差，因为该估计值并非</w:t>
+        <w:t xml:space="preserve">残差，原因在于该估计值并非</w:t>
       </w:r>
       <w:r>
         <w:t xml:space="preserve"> </w:t>
@@ -53081,7 +53081,7 @@
         <w:rPr>
           <w:rFonts w:hint="eastAsia"/>
         </w:rPr>
-        <w:t xml:space="preserve">胞元上的相同。网络预测的内部位移的精度不能迁移，因为它与网络训练所用的胞元族相关。</w:t>
+        <w:t xml:space="preserve">胞元上的相同。网络预测的内部位移的精度不能迁移，因其与网络训练所用的胞元族相关。</w:t>
       </w:r>
     </w:p>
     <w:p>

</xml_diff>

<commit_message>
R7: rebuild EN/CN PDFs, advisor set (dated 11 October 2026), figure index and Word files
build_advisor.py takes the Chinese date as an optional second argument.

Co-Authored-By: Claude Opus 5.5 <noreply@anthropic.com>
Claude-Session: https://claude.ai/code/session_0114mFUC9kQKF8s1RT519QXM
</commit_message>
<xml_diff>
--- a/docs/paper_p1/word/P1_supp_CN.docx
+++ b/docs/paper_p1/word/P1_supp_CN.docx
@@ -28030,7 +28030,7 @@
       <w:r>
         <w:t xml:space="preserve"> </w:t>
       </w:r>
-      <w:hyperlink r:id="rId9">
+      <w:hyperlink r:id="rId20">
         <w:r>
           <w:rPr>
             <w:rStyle w:val="Hyperlink"/>
@@ -34645,7 +34645,7 @@
               <m:e>
                 <m:r>
                   <m:rPr>
-                    <m:sty m:val="bi"/>
+                    <m:sty m:val="b"/>
                   </m:rPr>
                   <m:t>s</m:t>
                 </m:r>
@@ -34668,7 +34668,7 @@
           <m:e>
             <m:r>
               <m:rPr>
-                <m:sty m:val="bi"/>
+                <m:sty m:val="b"/>
               </m:rPr>
               <m:t>s</m:t>
             </m:r>
@@ -34701,7 +34701,7 @@
           <m:e>
             <m:r>
               <m:rPr>
-                <m:sty m:val="bi"/>
+                <m:sty m:val="b"/>
               </m:rPr>
               <m:t>s</m:t>
             </m:r>
@@ -38558,7 +38558,7 @@
                 <m:e>
                   <m:r>
                     <m:rPr>
-                      <m:sty m:val="bi"/>
+                      <m:sty m:val="b"/>
                     </m:rPr>
                     <m:t>τ</m:t>
                   </m:r>
@@ -38581,7 +38581,7 @@
                 <m:e>
                   <m:r>
                     <m:rPr>
-                      <m:sty m:val="bi"/>
+                      <m:sty m:val="b"/>
                     </m:rPr>
                     <m:t>τ</m:t>
                   </m:r>
@@ -38602,7 +38602,7 @@
                 <m:e>
                   <m:r>
                     <m:rPr>
-                      <m:sty m:val="bi"/>
+                      <m:sty m:val="b"/>
                     </m:rPr>
                     <m:t>τ</m:t>
                   </m:r>
@@ -38623,7 +38623,7 @@
                 <m:e>
                   <m:r>
                     <m:rPr>
-                      <m:sty m:val="bi"/>
+                      <m:sty m:val="b"/>
                     </m:rPr>
                     <m:t>τ</m:t>
                   </m:r>
@@ -39048,7 +39048,7 @@
                 <m:e>
                   <m:r>
                     <m:rPr>
-                      <m:sty m:val="bi"/>
+                      <m:sty m:val="b"/>
                     </m:rPr>
                     <m:t>τ</m:t>
                   </m:r>
@@ -39495,7 +39495,7 @@
             <w:r>
               <w:t xml:space="preserve"> </w:t>
             </w:r>
-            <w:hyperlink r:id="rId10">
+            <w:hyperlink r:id="rId21">
               <w:r>
                 <w:rPr>
                   <w:rStyle w:val="Hyperlink"/>
@@ -40796,7 +40796,7 @@
         <w:rPr>
           <w:rFonts w:hint="eastAsia"/>
         </w:rPr>
-        <w:t xml:space="preserve">细观尺度上分析的设计包括表</w:t>
+        <w:t xml:space="preserve">细尺度上分析的设计包括表</w:t>
       </w:r>
       <w:r>
         <w:t xml:space="preserve"> ST17 </w:t>
@@ -43186,7 +43186,7 @@
                   <m:e>
                     <m:r>
                       <m:rPr>
-                        <m:sty m:val="bi"/>
+                        <m:sty m:val="b"/>
                       </m:rPr>
                       <m:t>s</m:t>
                     </m:r>
@@ -43209,7 +43209,7 @@
               <m:e>
                 <m:r>
                   <m:rPr>
-                    <m:sty m:val="bi"/>
+                    <m:sty m:val="b"/>
                   </m:rPr>
                   <m:t>s</m:t>
                 </m:r>
@@ -43240,7 +43240,7 @@
               <m:e>
                 <m:r>
                   <m:rPr>
-                    <m:sty m:val="bi"/>
+                    <m:sty m:val="b"/>
                   </m:rPr>
                   <m:t>s</m:t>
                 </m:r>
@@ -45081,16 +45081,16 @@
         <w:rPr>
           <w:rFonts w:hint="eastAsia"/>
         </w:rPr>
-        <w:t xml:space="preserve">个单元的网格。细观模型固定切割胞元的全部切割平面单元自由度（表</w:t>
-      </w:r>
-      <w:r>
-        <w:t xml:space="preserve"> </w:t>
-      </w:r>
-      <w:r>
-        <w:rPr>
-          <w:rFonts w:hint="eastAsia"/>
-        </w:rPr>
-        <w:t xml:space="preserve">ST21），该支撑至少与仅作用于切割面的支撑同样刚硬。这一支撑降低了精确柔度，因而缩小了宏观模型对柔度的低估。对于均匀化梯度设计，宏观体积模型不再与细观尺度材料体积精确相等（表</w:t>
+        <w:t xml:space="preserve">个单元的网格。细尺度模型固定切割胞元的全部切割平面单元自由度（表</w:t>
+      </w:r>
+      <w:r>
+        <w:t xml:space="preserve"> </w:t>
+      </w:r>
+      <w:r>
+        <w:rPr>
+          <w:rFonts w:hint="eastAsia"/>
+        </w:rPr>
+        <w:t xml:space="preserve">ST21），该支撑至少与仅作用于切割面的支撑同样刚硬。这一支撑降低了精确柔度，因而缩小了宏观模型对柔度的低估。对于均匀化梯度设计，宏观体积模型不再与细尺度材料体积精确相等（表</w:t>
       </w:r>
       <w:r>
         <w:t xml:space="preserve"> </w:t>
@@ -45792,7 +45792,7 @@
         <w:rPr>
           <w:rFonts w:hint="eastAsia"/>
         </w:rPr>
-        <w:t xml:space="preserve">所有细观尺度数值均为</w:t>
+        <w:t xml:space="preserve">所有细尺度数值均为</w:t>
       </w:r>
       <w:r>
         <w:t xml:space="preserve"> NICE </w:t>
@@ -47178,7 +47178,7 @@
         <w:rPr>
           <w:rFonts w:hint="eastAsia"/>
         </w:rPr>
-        <w:t xml:space="preserve">均匀化与细观尺度</w:t>
+        <w:t xml:space="preserve">均匀化与细尺度</w:t>
       </w:r>
       <w:r>
         <w:t xml:space="preserve"> NICE </w:t>
@@ -47477,7 +47477,7 @@
               <w:rPr>
                 <w:rFonts w:hint="eastAsia"/>
               </w:rPr>
-              <w:t xml:space="preserve">细观尺度</w:t>
+              <w:t xml:space="preserve">细尺度</w:t>
             </w:r>
             <w:r>
               <w:t xml:space="preserve"> </w:t>
@@ -47785,7 +47785,7 @@
         <w:rPr>
           <w:rFonts w:hint="eastAsia"/>
         </w:rPr>
-        <w:t xml:space="preserve">与细观尺度材料体积</w:t>
+        <w:t xml:space="preserve">与细尺度材料体积</w:t>
       </w:r>
       <w:r>
         <w:t xml:space="preserve"> 4.569074 </w:t>
@@ -49225,7 +49225,7 @@
           <m:e>
             <m:r>
               <m:rPr>
-                <m:sty m:val="bi"/>
+                <m:sty m:val="b"/>
               </m:rPr>
               <m:t>τ</m:t>
             </m:r>
@@ -57441,18 +57441,18 @@
           <wp:inline>
             <wp:extent cx="5334000" cy="3384606"/>
             <wp:effectExtent b="0" l="0" r="0" t="0"/>
-            <wp:docPr descr="Figure S01" title="" id="12" name="Picture"/>
+            <wp:docPr descr="Figure S01" title="" id="23" name="Picture"/>
             <a:graphic>
               <a:graphicData uri="http://schemas.openxmlformats.org/drawingml/2006/picture">
                 <pic:pic>
                   <pic:nvPicPr>
-                    <pic:cNvPr descr="figures/S06_reference_verification.png" id="13" name="Picture"/>
+                    <pic:cNvPr descr="figures/S06_reference_verification.png" id="24" name="Picture"/>
                     <pic:cNvPicPr>
                       <a:picLocks noChangeArrowheads="1" noChangeAspect="1"/>
                     </pic:cNvPicPr>
                   </pic:nvPicPr>
                   <pic:blipFill>
-                    <a:blip r:embed="rId11"/>
+                    <a:blip r:embed="rId22"/>
                     <a:stretch>
                       <a:fillRect/>
                     </a:stretch>
@@ -57965,18 +57965,18 @@
           <wp:inline>
             <wp:extent cx="5334000" cy="4948966"/>
             <wp:effectExtent b="0" l="0" r="0" t="0"/>
-            <wp:docPr descr="Figure S02" title="" id="15" name="Picture"/>
+            <wp:docPr descr="Figure S02" title="" id="26" name="Picture"/>
             <a:graphic>
               <a:graphicData uri="http://schemas.openxmlformats.org/drawingml/2006/picture">
                 <pic:pic>
                   <pic:nvPicPr>
-                    <pic:cNvPr descr="figures/S01_distributions.png" id="16" name="Picture"/>
+                    <pic:cNvPr descr="figures/S01_distributions.png" id="27" name="Picture"/>
                     <pic:cNvPicPr>
                       <a:picLocks noChangeArrowheads="1" noChangeAspect="1"/>
                     </pic:cNvPicPr>
                   </pic:nvPicPr>
                   <pic:blipFill>
-                    <a:blip r:embed="rId14"/>
+                    <a:blip r:embed="rId25"/>
                     <a:stretch>
                       <a:fillRect/>
                     </a:stretch>
@@ -58103,18 +58103,18 @@
           <wp:inline>
             <wp:extent cx="5334000" cy="3822909"/>
             <wp:effectExtent b="0" l="0" r="0" t="0"/>
-            <wp:docPr descr="Figure S03" title="" id="18" name="Picture"/>
+            <wp:docPr descr="Figure S03" title="" id="29" name="Picture"/>
             <a:graphic>
               <a:graphicData uri="http://schemas.openxmlformats.org/drawingml/2006/picture">
                 <pic:pic>
                   <pic:nvPicPr>
-                    <pic:cNvPr descr="figures/S03_sensitivity_diagnostics.png" id="19" name="Picture"/>
+                    <pic:cNvPr descr="figures/S03_sensitivity_diagnostics.png" id="30" name="Picture"/>
                     <pic:cNvPicPr>
                       <a:picLocks noChangeArrowheads="1" noChangeAspect="1"/>
                     </pic:cNvPicPr>
                   </pic:nvPicPr>
                   <pic:blipFill>
-                    <a:blip r:embed="rId17"/>
+                    <a:blip r:embed="rId28"/>
                     <a:stretch>
                       <a:fillRect/>
                     </a:stretch>
@@ -58422,18 +58422,18 @@
           <wp:inline>
             <wp:extent cx="5334000" cy="4947154"/>
             <wp:effectExtent b="0" l="0" r="0" t="0"/>
-            <wp:docPr descr="Figure S04" title="" id="21" name="Picture"/>
+            <wp:docPr descr="Figure S04" title="" id="32" name="Picture"/>
             <a:graphic>
               <a:graphicData uri="http://schemas.openxmlformats.org/drawingml/2006/picture">
                 <pic:pic>
                   <pic:nvPicPr>
-                    <pic:cNvPr descr="figures/S07_energy_share_variants.png" id="22" name="Picture"/>
+                    <pic:cNvPr descr="figures/S07_energy_share_variants.png" id="33" name="Picture"/>
                     <pic:cNvPicPr>
                       <a:picLocks noChangeArrowheads="1" noChangeAspect="1"/>
                     </pic:cNvPicPr>
                   </pic:nvPicPr>
                   <pic:blipFill>
-                    <a:blip r:embed="rId20"/>
+                    <a:blip r:embed="rId31"/>
                     <a:stretch>
                       <a:fillRect/>
                     </a:stretch>
@@ -58978,10 +58978,10 @@
   <w:docDefaults>
     <w:rPrDefault>
       <w:rPr>
-        <w:rFonts w:asciiTheme="minorHAnsi" w:cstheme="minorBidi" w:eastAsiaTheme="minorEastAsia" w:hAnsiTheme="minorHAnsi"/>
+        <w:rFonts w:asciiTheme="minorHAnsi" w:cstheme="minorBidi" w:eastAsiaTheme="minorHAnsi" w:hAnsiTheme="minorHAnsi"/>
         <w:sz w:val="24"/>
         <w:szCs w:val="24"/>
-        <w:lang w:bidi="ar-SA" w:eastAsia="zh-CN" w:val="en-US"/>
+        <w:lang w:bidi="ar-SA" w:eastAsia="en-US" w:val="en-US"/>
       </w:rPr>
     </w:rPrDefault>
     <w:pPrDefault>
@@ -59522,6 +59522,13 @@
       </w:tblCellMar>
     </w:tblPr>
     <w:tblStylePr w:type="firstRow">
+      <w:tblPr>
+        <w:jc w:val="left"/>
+        <w:tblInd w:type="dxa" w:w="0"/>
+      </w:tblPr>
+      <w:trPr>
+        <w:jc w:val="left"/>
+      </w:trPr>
       <w:tcPr>
         <w:tcBorders>
           <w:bottom w:val="single"/>

</xml_diff>

<commit_message>
R7: rebuild the Chinese Word files after the Section 2 annotation round
Co-Authored-By: Claude Opus 5.5 <noreply@anthropic.com>
Claude-Session: https://claude.ai/code/session_0114mFUC9kQKF8s1RT519QXM
</commit_message>
<xml_diff>
--- a/docs/paper_p1/word/P1_supp_CN.docx
+++ b/docs/paper_p1/word/P1_supp_CN.docx
@@ -4637,7 +4637,7 @@
         <w:rPr>
           <w:rFonts w:hint="eastAsia"/>
         </w:rPr>
-        <w:t xml:space="preserve">带求交之前的体积。任意两个验证几何在立方体对称变换下均不重合。在</w:t>
+        <w:t xml:space="preserve">材料层求交之前的体积。任意两个验证几何在立方体对称变换下均不重合。在</w:t>
       </w:r>
       <w:r>
         <w:t xml:space="preserve"> </w:t>
@@ -17655,7 +17655,7 @@
         <w:rPr>
           <w:rFonts w:hint="eastAsia"/>
         </w:rPr>
-        <w:t xml:space="preserve">上的基础网络，考察相邻胞元表面的</w:t>
+        <w:t xml:space="preserve">上的基础网络，考察相邻胞元边界面的</w:t>
       </w:r>
       <w:r>
         <w:t xml:space="preserve"> z </w:t>
@@ -21417,7 +21417,7 @@
         <w:rPr>
           <w:rFonts w:hint="eastAsia"/>
         </w:rPr>
-        <w:t xml:space="preserve">向表面上没有材料。在</w:t>
+        <w:t xml:space="preserve">向边界面上没有材料。在</w:t>
       </w:r>
       <w:r>
         <w:t xml:space="preserve"> </w:t>
@@ -21890,7 +21890,7 @@
         <w:rPr>
           <w:rFonts w:hint="eastAsia"/>
         </w:rPr>
-        <w:t xml:space="preserve">单个胞元在一个胞元表面上固支，在另一表面上沿三个坐标方向分别施加单位面力载荷，并在</w:t>
+        <w:t xml:space="preserve">单个胞元在一个胞元边界面上固支，在另一边界面上沿三个坐标方向分别施加单位面力载荷，并在</w:t>
       </w:r>
       <w:r>
         <w:t xml:space="preserve"> </w:t>
@@ -21934,7 +21934,7 @@
         <w:rPr>
           <w:rFonts w:hint="eastAsia"/>
         </w:rPr>
-        <w:t xml:space="preserve">唯一含材料的胞元表面即为固支面，因此改为施加合力为单位值的体力载荷。表中各项斜线前为相对</w:t>
+        <w:t xml:space="preserve">唯一含材料的胞元边界面即为固支面，因此改为施加合力为单位值的体力载荷。表中各项斜线前为相对</w:t>
       </w:r>
       <w:r>
         <w:t xml:space="preserve"> </w:t>
@@ -23367,7 +23367,7 @@
         <w:rPr>
           <w:rFonts w:hint="eastAsia"/>
         </w:rPr>
-        <w:t xml:space="preserve">消融：胞元表面的</w:t>
+        <w:t xml:space="preserve">消融：胞元边界面的</w:t>
       </w:r>
       <w:r>
         <w:t xml:space="preserve"> Bernstein </w:t>
@@ -23405,7 +23405,7 @@
         <w:rPr>
           <w:rFonts w:hint="eastAsia"/>
         </w:rPr>
-        <w:t xml:space="preserve">补），仅缩减胞元表面主自由度位移的表示。</w:t>
+        <w:t xml:space="preserve">补），仅缩减胞元边界面主自由度位移的表示。</w:t>
       </w:r>
     </w:p>
     <w:p>
@@ -23439,7 +23439,7 @@
         <w:rPr>
           <w:rFonts w:hint="eastAsia"/>
         </w:rPr>
-        <w:t xml:space="preserve">受限空间在每个胞元选定的胞元表面上采用</w:t>
+        <w:t xml:space="preserve">受限空间在每个胞元选定的胞元边界面上采用</w:t>
       </w:r>
       <w:r>
         <w:t xml:space="preserve"> </w:t>
@@ -23491,7 +23491,7 @@
         <w:rPr>
           <w:rFonts w:hint="eastAsia"/>
         </w:rPr>
-        <w:t xml:space="preserve">在胞元间共享的自由度上保持一致。切割平面单元中不在胞元表面上的自由度仍取单位列。施加支撑后的</w:t>
+        <w:t xml:space="preserve">在胞元间共享的自由度上保持一致。切割平面单元中不在胞元边界面上的自由度仍取单位列。施加支撑后的</w:t>
       </w:r>
       <w:r>
         <w:t xml:space="preserve"> Galerkin </w:t>
@@ -23742,7 +23742,7 @@
         <w:rPr>
           <w:rFonts w:hint="eastAsia"/>
         </w:rPr>
-        <w:t xml:space="preserve">该比较在这一受限的胞元表面位移空间内使用各胞元的精确凝聚刚度矩阵，因此内部位移是精确的，全部误差均来自受限的边界。考察两种情形：一是所有胞元表面均受限，相当于整个点阵完全由此类子结构构成；二是仅共享界面受限。</w:t>
+        <w:t xml:space="preserve">该比较在这一受限的胞元边界面位移空间内使用各胞元的精确凝聚刚度矩阵，因此内部位移是精确的，全部误差均来自受限的边界。考察两种情形：一是所有胞元边界面均受限，相当于整个点阵完全由此类子结构构成；二是仅共享界面受限。</w:t>
       </w:r>
     </w:p>
     <w:p>
@@ -23989,7 +23989,7 @@
         <w:rPr>
           <w:rFonts w:hint="eastAsia"/>
         </w:rPr>
-        <w:t xml:space="preserve">载荷：被测胞元表面上的三个面力与相邻胞元表面上的三个面力。</w:t>
+        <w:t xml:space="preserve">载荷：被测胞元边界面上的三个面力与相邻胞元边界面上的三个面力。</w:t>
       </w:r>
     </w:p>
     <w:p>
@@ -24004,7 +24004,7 @@
         <w:rPr>
           <w:rFonts w:hint="eastAsia"/>
         </w:rPr>
-        <w:t xml:space="preserve">切割平面单元中不在胞元表面上的自由度不受限制，这对受限模型有利（受控自由度见表</w:t>
+        <w:t xml:space="preserve">切割平面单元中不在胞元边界面上的自由度不受限制，这对受限模型有利（受控自由度见表</w:t>
       </w:r>
       <w:r>
         <w:t xml:space="preserve"> </w:t>
@@ -24048,7 +24048,7 @@
         <w:rPr>
           <w:rFonts w:hint="eastAsia"/>
         </w:rPr>
-        <w:t xml:space="preserve">胞元表面位移的</w:t>
+        <w:t xml:space="preserve">胞元边界面位移的</w:t>
       </w:r>
       <w:r>
         <w:t xml:space="preserve"> Bernstein </w:t>
@@ -24086,7 +24086,7 @@
         <w:rPr>
           <w:rFonts w:hint="eastAsia"/>
         </w:rPr>
-        <w:t xml:space="preserve">作用于受限的胞元表面；切割平面单元的自由度仍取单位表示。受控自由度包括这些不受限的切割平面单元自由度。所有误差均为所列载荷集上的最大值（%），以采用全部主自由度的解为基准；灵敏度列指被测胞元的灵敏度向量。被测面载荷为被测胞元加载面上的三个单位面力载荷，六载荷集在此基础上加入相邻胞元表面上的三个面力。两个载荷集的最大值未必出现在同一载荷下。</w:t>
+        <w:t xml:space="preserve">作用于受限的胞元边界面；切割平面单元的自由度仍取单位表示。受控自由度包括这些不受限的切割平面单元自由度。所有误差均为所列载荷集上的最大值（%），以采用全部主自由度的解为基准；灵敏度列指被测胞元的灵敏度向量。被测面载荷为被测胞元加载面上的三个单位面力载荷，六载荷集在此基础上加入相邻胞元边界面上的三个面力。两个载荷集的最大值未必出现在同一载荷下。</w:t>
       </w:r>
     </w:p>
     <w:p>
@@ -24100,7 +24100,7 @@
         <w:rPr>
           <w:rFonts w:hint="eastAsia"/>
         </w:rPr>
-        <w:t xml:space="preserve">所有胞元表面均受限</w:t>
+        <w:t xml:space="preserve">所有胞元边界面均受限</w:t>
       </w:r>
     </w:p>
     <w:tbl>
@@ -28587,7 +28587,7 @@
               <w:rPr>
                 <w:rFonts w:hint="eastAsia"/>
               </w:rPr>
-              <w:t xml:space="preserve">胞元表面以外的切割平面单元自由度（占未约束主自由度的比例）</w:t>
+              <w:t xml:space="preserve">胞元边界面以外的切割平面单元自由度（占未约束主自由度的比例）</w:t>
             </w:r>
           </w:p>
         </w:tc>
@@ -33211,7 +33211,7 @@
         <w:rPr>
           <w:rFonts w:hint="eastAsia"/>
         </w:rPr>
-        <w:t xml:space="preserve">的两种构型中，六个面载荷为沿三个笛卡尔坐标轴、作用于被测胞元受载表面的面力载荷，以及作用于相邻胞元受载表面的同样三个载荷。面力载荷由</w:t>
+        <w:t xml:space="preserve">的两种构型中，六个面载荷为沿三个笛卡尔坐标轴、作用于被测胞元受载边界面的面力载荷，以及作用于相邻胞元受载边界面的同样三个载荷。面力载荷由</w:t>
       </w:r>
       <w:r>
         <w:t xml:space="preserve"> Q2 </w:t>
@@ -33220,7 +33220,7 @@
         <w:rPr>
           <w:rFonts w:hint="eastAsia"/>
         </w:rPr>
-        <w:t xml:space="preserve">表面形函数积分得到；每个节点载荷向量在消除支撑之前归一化为单位合力，然后消除固支分量。若被测胞元的切割表面上有经同样归一化的三个面力载荷，则其结果单独报告。相邻胞元为未切割胞元。因此，在被测胞元的切割平面与共享面相交之处，该胞元对是一种测试构型，而不是物理上被切割的试件。</w:t>
+        <w:t xml:space="preserve">表面形函数积分得到；每个节点载荷向量在消除支撑之前归一化为单位合力，然后消除固支分量。若被测胞元的切割面上有经同样归一化的三个面力载荷，则其结果单独报告。相邻胞元为未切割胞元。因此，在被测胞元的切割平面与共享面相交之处，该胞元对是一种测试构型，而不是物理上被切割的试件。</w:t>
       </w:r>
     </w:p>
     <w:p>
@@ -44103,7 +44103,7 @@
         <w:rPr>
           <w:rFonts w:hint="eastAsia"/>
         </w:rPr>
-        <w:t xml:space="preserve">。胞元相对表面上的节点视为同一节点，涨落场取周期形式并固定一个节点。由六个单位宏观应变得到单位胞元的</w:t>
+        <w:t xml:space="preserve">。胞元相对边界面上的节点视为同一节点，涨落场取周期形式并固定一个节点。由六个单位宏观应变得到单位胞元的</w:t>
       </w:r>
       <w:r>
         <w:t xml:space="preserve"> </w:t>
@@ -52483,7 +52483,7 @@
         <w:rPr>
           <w:rFonts w:hint="eastAsia"/>
         </w:rPr>
-        <w:t xml:space="preserve">节的性质对这些胞元也成立。原因在于假设</w:t>
+        <w:t xml:space="preserve">节的性质对这些胞元也成立。原因在于条件</w:t>
       </w:r>
       <w:r>
         <w:t xml:space="preserve"> (A1)–(A3) </w:t>
@@ -56909,7 +56909,7 @@
         <w:rPr>
           <w:rFonts w:hint="eastAsia"/>
         </w:rPr>
-        <w:t xml:space="preserve">相邻胞元表面的</w:t>
+        <w:t xml:space="preserve">相邻胞元边界面的</w:t>
       </w:r>
       <w:r>
         <w:t xml:space="preserve"> z </w:t>
@@ -56963,7 +56963,7 @@
         <w:rPr>
           <w:rFonts w:hint="eastAsia"/>
         </w:rPr>
-        <w:t xml:space="preserve">被测胞元表面的</w:t>
+        <w:t xml:space="preserve">被测胞元边界面的</w:t>
       </w:r>
       <w:r>
         <w:t xml:space="preserve"> y </w:t>
@@ -57513,7 +57513,7 @@
         <w:rPr>
           <w:rFonts w:hint="eastAsia"/>
         </w:rPr>
-        <w:t xml:space="preserve">单个胞元在一个胞元表面上固支，并在另一个面上沿三个笛卡尔坐标方向分别受单位面力载荷作用。在</w:t>
+        <w:t xml:space="preserve">单个胞元在一个胞元边界面上固支，并在另一个面上沿三个笛卡尔坐标方向分别受单位面力载荷作用。在</w:t>
       </w:r>
       <w:r>
         <w:t xml:space="preserve"> (a)、(b) </w:t>
@@ -58724,7 +58724,7 @@
         <w:rPr>
           <w:rFonts w:hint="eastAsia"/>
         </w:rPr>
-        <w:t xml:space="preserve">在相邻胞元表面</w:t>
+        <w:t xml:space="preserve">在相邻胞元边界面</w:t>
       </w:r>
       <w:r>
         <w:t xml:space="preserve"> z </w:t>

</xml_diff>

<commit_message>
R7 (CN): dissolve Section 2.5; interior loads in a new Appendix C.3
Requirements on the approximate condensed stiffness open Section 3; the
properties of K stay in 2.3, the support assumption is stated in 2.4, the two
properties of the recovery operator in 3.1; Propositions 1-4 state their
premises directly and the labels (A1)-(A3), (D) are removed. 2.3 assumes loads
on retained DOFs "for brevity" and points to the new Appendix C.3, which treats
interior loads. Appendix B.1 renamed. Chinese Word files rebuilt. The English
units follow after the author's reading.

Co-Authored-By: Claude Opus 5.5 <noreply@anthropic.com>
Claude-Session: https://claude.ai/code/session_0114mFUC9kQKF8s1RT519QXM
</commit_message>
<xml_diff>
--- a/docs/paper_p1/word/P1_supp_CN.docx
+++ b/docs/paper_p1/word/P1_supp_CN.docx
@@ -52483,16 +52483,7 @@
         <w:rPr>
           <w:rFonts w:hint="eastAsia"/>
         </w:rPr>
-        <w:t xml:space="preserve">节的性质对这些胞元也成立。原因在于条件</w:t>
-      </w:r>
-      <w:r>
-        <w:t xml:space="preserve"> (A1)–(A3) </w:t>
-      </w:r>
-      <w:r>
-        <w:rPr>
-          <w:rFonts w:hint="eastAsia"/>
-        </w:rPr>
-        <w:t xml:space="preserve">涉及的是刚度和装配，而网络的位移恢复按构造在主自由度上等于给定位移，并能再现刚体运动。命题</w:t>
+        <w:t xml:space="preserve">节的性质对这些胞元也成立。原因在于这些结论只依赖刚度矩阵、装配方式和位移恢复算子的两项性质，而网络的位移恢复按构造在主自由度上等于给定位移，并能再现刚体运动。命题</w:t>
       </w:r>
       <w:r>
         <w:t xml:space="preserve"> 2 </w:t>

</xml_diff>

<commit_message>
R7: rebuild EN/CN PDFs, advisor set (dated 17 October 2026), figure index and Word files
After the GPU-memory update of Table 5 and the deployed-implementation values of
ST13. No LaTeX errors or undefined references; CN main 69 pages, CN supplement 45,
EN main 74, EN supplement 47.

Co-Authored-By: Claude Opus 5.5 <noreply@anthropic.com>
Claude-Session: https://claude.ai/code/session_0114mFUC9kQKF8s1RT519QXM
</commit_message>
<xml_diff>
--- a/docs/paper_p1/word/P1_supp_CN.docx
+++ b/docs/paper_p1/word/P1_supp_CN.docx
@@ -30948,7 +30948,52 @@
         <w:rPr>
           <w:rFonts w:hint="eastAsia"/>
         </w:rPr>
-        <w:t xml:space="preserve">内存为进程分配的峰值，CPU</w:t>
+        <w:t xml:space="preserve">内存为整块</w:t>
+      </w:r>
+      <w:r>
+        <w:t xml:space="preserve"> GPU </w:t>
+      </w:r>
+      <w:r>
+        <w:rPr>
+          <w:rFonts w:hint="eastAsia"/>
+        </w:rPr>
+        <w:t xml:space="preserve">的峰值内存占用（nvidia-smi</w:t>
+      </w:r>
+      <w:r>
+        <w:t xml:space="preserve"> </w:t>
+      </w:r>
+      <w:r>
+        <w:rPr>
+          <w:rFonts w:hint="eastAsia"/>
+        </w:rPr>
+        <w:t xml:space="preserve">每</w:t>
+      </w:r>
+      <w:r>
+        <w:t xml:space="preserve"> 0.1 s </w:t>
+      </w:r>
+      <w:r>
+        <w:rPr>
+          <w:rFonts w:hint="eastAsia"/>
+        </w:rPr>
+        <w:t xml:space="preserve">采样一次），除张量外还包括</w:t>
+      </w:r>
+      <w:r>
+        <w:t xml:space="preserve"> CUDA </w:t>
+      </w:r>
+      <w:r>
+        <w:rPr>
+          <w:rFonts w:hint="eastAsia"/>
+        </w:rPr>
+        <w:t xml:space="preserve">上下文、cuDSS</w:t>
+      </w:r>
+      <w:r>
+        <w:t xml:space="preserve"> </w:t>
+      </w:r>
+      <w:r>
+        <w:rPr>
+          <w:rFonts w:hint="eastAsia"/>
+        </w:rPr>
+        <w:t xml:space="preserve">的分解以及缓存分配器保留的内存；CPU</w:t>
       </w:r>
       <w:r>
         <w:t xml:space="preserve"> </w:t>
@@ -31655,16 +31700,25 @@
         <w:rPr>
           <w:rFonts w:hint="eastAsia"/>
         </w:rPr>
-        <w:t xml:space="preserve">节）。胞元准备：几何预处理，以及胞元设置、矩积分与刚度装配；NICE</w:t>
-      </w:r>
-      <w:r>
-        <w:t xml:space="preserve"> </w:t>
-      </w:r>
-      <w:r>
-        <w:rPr>
-          <w:rFonts w:hint="eastAsia"/>
-        </w:rPr>
-        <w:t xml:space="preserve">在</w:t>
+        <w:t xml:space="preserve">节）。两条路线都读取已生成的胞元几何，几何生成不计入计时（与表</w:t>
+      </w:r>
+      <w:r>
+        <w:t xml:space="preserve"> 5 </w:t>
+      </w:r>
+      <w:r>
+        <w:rPr>
+          <w:rFonts w:hint="eastAsia"/>
+        </w:rPr>
+        <w:t xml:space="preserve">相同）。胞元准备：对</w:t>
+      </w:r>
+      <w:r>
+        <w:t xml:space="preserve"> NICE </w:t>
+      </w:r>
+      <w:r>
+        <w:rPr>
+          <w:rFonts w:hint="eastAsia"/>
+        </w:rPr>
+        <w:t xml:space="preserve">为胞元设置与单元矩计算，在</w:t>
       </w:r>
       <w:r>
         <w:t xml:space="preserve"> GPU </w:t>
@@ -31673,7 +31727,7 @@
         <w:rPr>
           <w:rFonts w:hint="eastAsia"/>
         </w:rPr>
-        <w:t xml:space="preserve">上进行，常规路线在</w:t>
+        <w:t xml:space="preserve">上进行；对常规路线为胞元设置、矩积分与刚度装配，在</w:t>
       </w:r>
       <w:r>
         <w:t xml:space="preserve"> CPU </w:t>
@@ -31691,7 +31745,7 @@
         <w:rPr>
           <w:rFonts w:hint="eastAsia"/>
         </w:rPr>
-        <w:t xml:space="preserve">为网络编码与修正设置（光滑区间与粗网格分解）；对常规路线为</w:t>
+        <w:t xml:space="preserve">为网络输入、编码与修正设置（光滑区间与粗网格分解）；对常规路线为</w:t>
       </w:r>
       <w:r>
         <w:t xml:space="preserve"> MKL </w:t>
@@ -31718,25 +31772,16 @@
         <w:rPr>
           <w:rFonts w:hint="eastAsia"/>
         </w:rPr>
-        <w:t xml:space="preserve">分解。内存单位为</w:t>
-      </w:r>
-      <w:r>
-        <w:t xml:space="preserve"> </w:t>
-      </w:r>
-      <w:r>
-        <w:rPr>
-          <w:rFonts w:hint="eastAsia"/>
-        </w:rPr>
-        <w:t xml:space="preserve">GiB：NICE</w:t>
-      </w:r>
-      <w:r>
-        <w:t xml:space="preserve"> </w:t>
-      </w:r>
-      <w:r>
-        <w:rPr>
-          <w:rFonts w:hint="eastAsia"/>
-        </w:rPr>
-        <w:t xml:space="preserve">的网络状态与修正所占用的</w:t>
+        <w:t xml:space="preserve">分解。NICE</w:t>
+      </w:r>
+      <w:r>
+        <w:t xml:space="preserve"> </w:t>
+      </w:r>
+      <w:r>
+        <w:rPr>
+          <w:rFonts w:hint="eastAsia"/>
+        </w:rPr>
+        <w:t xml:space="preserve">的耗时不含每个进程开始时一次性的</w:t>
       </w:r>
       <w:r>
         <w:t xml:space="preserve"> GPU </w:t>
@@ -31745,7 +31790,52 @@
         <w:rPr>
           <w:rFonts w:hint="eastAsia"/>
         </w:rPr>
-        <w:t xml:space="preserve">内存，或</w:t>
+        <w:t xml:space="preserve">核函数编译与初始化（约</w:t>
+      </w:r>
+      <w:r>
+        <w:t xml:space="preserve"> 1.5 </w:t>
+      </w:r>
+      <w:r>
+        <w:rPr>
+          <w:rFonts w:hint="eastAsia"/>
+        </w:rPr>
+        <w:t xml:space="preserve">s）。内存单位为</w:t>
+      </w:r>
+      <w:r>
+        <w:t xml:space="preserve"> </w:t>
+      </w:r>
+      <w:r>
+        <w:rPr>
+          <w:rFonts w:hint="eastAsia"/>
+        </w:rPr>
+        <w:t xml:space="preserve">GiB：对</w:t>
+      </w:r>
+      <w:r>
+        <w:t xml:space="preserve"> NICE </w:t>
+      </w:r>
+      <w:r>
+        <w:rPr>
+          <w:rFonts w:hint="eastAsia"/>
+        </w:rPr>
+        <w:t xml:space="preserve">为部署实现在修正设置完成后为该胞元保存的全部</w:t>
+      </w:r>
+      <w:r>
+        <w:t xml:space="preserve"> GPU </w:t>
+      </w:r>
+      <w:r>
+        <w:rPr>
+          <w:rFonts w:hint="eastAsia"/>
+        </w:rPr>
+        <w:t xml:space="preserve">内存，包括网络状态、修正以及以单元矩形式保存的刚度（部署实现不装配胞元刚度矩阵，单元矩每个胞元占</w:t>
+      </w:r>
+      <w:r>
+        <w:t xml:space="preserve"> 0.03–0.09 </w:t>
+      </w:r>
+      <w:r>
+        <w:rPr>
+          <w:rFonts w:hint="eastAsia"/>
+        </w:rPr>
+        <w:t xml:space="preserve">GiB）；对常规路线为</w:t>
       </w:r>
       <w:r>
         <w:t xml:space="preserve"> PARDISO </w:t>
@@ -31754,30 +31844,7 @@
         <w:rPr>
           <w:rFonts w:hint="eastAsia"/>
         </w:rPr>
-        <w:t xml:space="preserve">的分解存储（iparm(17)）。两者均不包括胞元刚度</w:t>
-      </w:r>
-      <w:r>
-        <w:t xml:space="preserve"> </w:t>
-      </w:r>
-      <m:oMath>
-        <m:r>
-          <m:t>K</m:t>
-        </m:r>
-      </m:oMath>
-      <w:r>
-        <w:rPr>
-          <w:rFonts w:hint="eastAsia"/>
-        </w:rPr>
-        <w:t xml:space="preserve">，两条路线都需保存该矩阵（最后一列，GPU</w:t>
-      </w:r>
-      <w:r>
-        <w:t xml:space="preserve"> </w:t>
-      </w:r>
-      <w:r>
-        <w:rPr>
-          <w:rFonts w:hint="eastAsia"/>
-        </w:rPr>
-        <w:t xml:space="preserve">存储格式）。</w:t>
+        <w:t xml:space="preserve">的分解存储（iparm(17)），此外还需保存装配后的胞元刚度矩阵。</w:t>
       </w:r>
     </w:p>
     <w:tbl>
@@ -31788,12 +31855,11 @@
         <w:tblLook w:firstRow="1" w:lastRow="0" w:firstColumn="0" w:lastColumn="0" w:noHBand="0" w:noVBand="0" w:val="0020"/>
       </w:tblPr>
       <w:tblGrid>
-        <w:gridCol w:w="1320"/>
-        <w:gridCol w:w="1320"/>
-        <w:gridCol w:w="1320"/>
-        <w:gridCol w:w="1320"/>
-        <w:gridCol w:w="1320"/>
-        <w:gridCol w:w="1320"/>
+        <w:gridCol w:w="1584"/>
+        <w:gridCol w:w="1584"/>
+        <w:gridCol w:w="1584"/>
+        <w:gridCol w:w="1584"/>
+        <w:gridCol w:w="1584"/>
       </w:tblGrid>
       <w:tr>
         <w:trPr>
@@ -31914,25 +31980,6 @@
             </w:r>
           </w:p>
         </w:tc>
-        <w:tc>
-          <w:tcPr/>
-          <w:p>
-            <w:pPr>
-              <w:pStyle w:val="Compact"/>
-            </w:pPr>
-            <m:oMath>
-              <m:r>
-                <m:t>K</m:t>
-              </m:r>
-            </m:oMath>
-            <w:r>
-              <w:rPr>
-                <w:rFonts w:hint="eastAsia"/>
-              </w:rPr>
-              <w:t xml:space="preserve">（GiB）</w:t>
-            </w:r>
-          </w:p>
-        </w:tc>
       </w:tr>
       <w:tr>
         <w:tc>
@@ -31967,40 +32014,29 @@
               <w:pStyle w:val="Compact"/>
             </w:pPr>
             <w:r>
-              <w:t xml:space="preserve">5.3 / 27.3</w:t>
-            </w:r>
-          </w:p>
-        </w:tc>
-        <w:tc>
-          <w:tcPr/>
-          <w:p>
-            <w:pPr>
-              <w:pStyle w:val="Compact"/>
-            </w:pPr>
-            <w:r>
-              <w:t xml:space="preserve">0.72 / 10.5</w:t>
-            </w:r>
-          </w:p>
-        </w:tc>
-        <w:tc>
-          <w:tcPr/>
-          <w:p>
-            <w:pPr>
-              <w:pStyle w:val="Compact"/>
-            </w:pPr>
-            <w:r>
-              <w:t xml:space="preserve">0.74 / 2.89</w:t>
-            </w:r>
-          </w:p>
-        </w:tc>
-        <w:tc>
-          <w:tcPr/>
-          <w:p>
-            <w:pPr>
-              <w:pStyle w:val="Compact"/>
-            </w:pPr>
-            <w:r>
-              <w:t xml:space="preserve">1.39</w:t>
+              <w:t xml:space="preserve">0.46 / 27.3</w:t>
+            </w:r>
+          </w:p>
+        </w:tc>
+        <w:tc>
+          <w:tcPr/>
+          <w:p>
+            <w:pPr>
+              <w:pStyle w:val="Compact"/>
+            </w:pPr>
+            <w:r>
+              <w:t xml:space="preserve">0.29 / 10.5</w:t>
+            </w:r>
+          </w:p>
+        </w:tc>
+        <w:tc>
+          <w:tcPr/>
+          <w:p>
+            <w:pPr>
+              <w:pStyle w:val="Compact"/>
+            </w:pPr>
+            <w:r>
+              <w:t xml:space="preserve">0.48 / 2.89</w:t>
             </w:r>
           </w:p>
         </w:tc>
@@ -32038,40 +32074,29 @@
               <w:pStyle w:val="Compact"/>
             </w:pPr>
             <w:r>
-              <w:t xml:space="preserve">3.0 / 10.9</w:t>
-            </w:r>
-          </w:p>
-        </w:tc>
-        <w:tc>
-          <w:tcPr/>
-          <w:p>
-            <w:pPr>
-              <w:pStyle w:val="Compact"/>
-            </w:pPr>
-            <w:r>
-              <w:t xml:space="preserve">0.16 / 1.9</w:t>
-            </w:r>
-          </w:p>
-        </w:tc>
-        <w:tc>
-          <w:tcPr/>
-          <w:p>
-            <w:pPr>
-              <w:pStyle w:val="Compact"/>
-            </w:pPr>
-            <w:r>
-              <w:t xml:space="preserve">0.25 / 0.60</w:t>
-            </w:r>
-          </w:p>
-        </w:tc>
-        <w:tc>
-          <w:tcPr/>
-          <w:p>
-            <w:pPr>
-              <w:pStyle w:val="Compact"/>
-            </w:pPr>
-            <w:r>
-              <w:t xml:space="preserve">0.51</w:t>
+              <w:t xml:space="preserve">0.27 / 10.9</w:t>
+            </w:r>
+          </w:p>
+        </w:tc>
+        <w:tc>
+          <w:tcPr/>
+          <w:p>
+            <w:pPr>
+              <w:pStyle w:val="Compact"/>
+            </w:pPr>
+            <w:r>
+              <w:t xml:space="preserve">0.13 / 1.9</w:t>
+            </w:r>
+          </w:p>
+        </w:tc>
+        <w:tc>
+          <w:tcPr/>
+          <w:p>
+            <w:pPr>
+              <w:pStyle w:val="Compact"/>
+            </w:pPr>
+            <w:r>
+              <w:t xml:space="preserve">0.19 / 0.60</w:t>
             </w:r>
           </w:p>
         </w:tc>
@@ -32109,40 +32134,29 @@
               <w:pStyle w:val="Compact"/>
             </w:pPr>
             <w:r>
-              <w:t xml:space="preserve">6.1 / 45.0</w:t>
-            </w:r>
-          </w:p>
-        </w:tc>
-        <w:tc>
-          <w:tcPr/>
-          <w:p>
-            <w:pPr>
-              <w:pStyle w:val="Compact"/>
-            </w:pPr>
-            <w:r>
-              <w:t xml:space="preserve">0.78 / 27.3</w:t>
-            </w:r>
-          </w:p>
-        </w:tc>
-        <w:tc>
-          <w:tcPr/>
-          <w:p>
-            <w:pPr>
-              <w:pStyle w:val="Compact"/>
-            </w:pPr>
-            <w:r>
-              <w:t xml:space="preserve">1.20 / 6.18</w:t>
-            </w:r>
-          </w:p>
-        </w:tc>
-        <w:tc>
-          <w:tcPr/>
-          <w:p>
-            <w:pPr>
-              <w:pStyle w:val="Compact"/>
-            </w:pPr>
-            <w:r>
-              <w:t xml:space="preserve">2.32</w:t>
+              <w:t xml:space="preserve">0.58 / 45.0</w:t>
+            </w:r>
+          </w:p>
+        </w:tc>
+        <w:tc>
+          <w:tcPr/>
+          <w:p>
+            <w:pPr>
+              <w:pStyle w:val="Compact"/>
+            </w:pPr>
+            <w:r>
+              <w:t xml:space="preserve">0.52 / 27.3</w:t>
+            </w:r>
+          </w:p>
+        </w:tc>
+        <w:tc>
+          <w:tcPr/>
+          <w:p>
+            <w:pPr>
+              <w:pStyle w:val="Compact"/>
+            </w:pPr>
+            <w:r>
+              <w:t xml:space="preserve">0.83 / 6.18</w:t>
             </w:r>
           </w:p>
         </w:tc>
@@ -32180,40 +32194,29 @@
               <w:pStyle w:val="Compact"/>
             </w:pPr>
             <w:r>
-              <w:t xml:space="preserve">6.5 / 47.0</w:t>
-            </w:r>
-          </w:p>
-        </w:tc>
-        <w:tc>
-          <w:tcPr/>
-          <w:p>
-            <w:pPr>
-              <w:pStyle w:val="Compact"/>
-            </w:pPr>
-            <w:r>
-              <w:t xml:space="preserve">1.09 / 48.9</w:t>
-            </w:r>
-          </w:p>
-        </w:tc>
-        <w:tc>
-          <w:tcPr/>
-          <w:p>
-            <w:pPr>
-              <w:pStyle w:val="Compact"/>
-            </w:pPr>
-            <w:r>
-              <w:t xml:space="preserve">1.37 / 9.42</w:t>
-            </w:r>
-          </w:p>
-        </w:tc>
-        <w:tc>
-          <w:tcPr/>
-          <w:p>
-            <w:pPr>
-              <w:pStyle w:val="Compact"/>
-            </w:pPr>
-            <w:r>
-              <w:t xml:space="preserve">2.71</w:t>
+              <w:t xml:space="preserve">0.68 / 47.0</w:t>
+            </w:r>
+          </w:p>
+        </w:tc>
+        <w:tc>
+          <w:tcPr/>
+          <w:p>
+            <w:pPr>
+              <w:pStyle w:val="Compact"/>
+            </w:pPr>
+            <w:r>
+              <w:t xml:space="preserve">0.76 / 48.9</w:t>
+            </w:r>
+          </w:p>
+        </w:tc>
+        <w:tc>
+          <w:tcPr/>
+          <w:p>
+            <w:pPr>
+              <w:pStyle w:val="Compact"/>
+            </w:pPr>
+            <w:r>
+              <w:t xml:space="preserve">1.08 / 9.42</w:t>
             </w:r>
           </w:p>
         </w:tc>

</xml_diff>